<commit_message>
cambio a version UE 4.27
cambiamos de Unreal Engine 5.8 a la version 4.27 para mejor compatibilidad
</commit_message>
<xml_diff>
--- a/LCS_Sprint1_Decision_Tecnologica.docx
+++ b/LCS_Sprint1_Decision_Tecnologica.docx
@@ -111,7 +111,6 @@
         <w:trPr>
           <w:cantSplit/>
           <w:jc w:val="center"/>
-          <w:cantSplit/>
         </w:trPr>
         <w:tc>
           <w:tcPr>
@@ -158,7 +157,13 @@
               <w:rPr>
                 <w:sz w:val="21"/>
               </w:rPr>
-              <w:t>¿Me quedo o me voy? — Laboratorio de experimentación, movimiento y física</w:t>
+              <w:t xml:space="preserve">¿Me quedo o me voy? — Laboratorio de </w:t>
+            </w:r>
+            <w:r>
+              <w:rPr>
+                <w:sz w:val="21"/>
+              </w:rPr>
+              <w:t>experimentación, movimiento y física</w:t>
             </w:r>
           </w:p>
         </w:tc>
@@ -167,7 +172,6 @@
         <w:trPr>
           <w:cantSplit/>
           <w:jc w:val="center"/>
-          <w:cantSplit/>
         </w:trPr>
         <w:tc>
           <w:tcPr>
@@ -243,7 +247,6 @@
         <w:trPr>
           <w:cantSplit/>
           <w:jc w:val="center"/>
-          <w:cantSplit/>
         </w:trPr>
         <w:tc>
           <w:tcPr>
@@ -301,7 +304,6 @@
         <w:trPr>
           <w:cantSplit/>
           <w:jc w:val="center"/>
-          <w:cantSplit/>
         </w:trPr>
         <w:tc>
           <w:tcPr>
@@ -357,7 +359,6 @@
         <w:trPr>
           <w:cantSplit/>
           <w:jc w:val="center"/>
-          <w:cantSplit/>
         </w:trPr>
         <w:tc>
           <w:tcPr>
@@ -444,25 +445,24 @@
         <w:pStyle w:val="Ttulo1"/>
       </w:pPr>
       <w:r>
+        <w:lastRenderedPageBreak/>
         <w:t>1. Objetivo</w:t>
       </w:r>
     </w:p>
     <w:p>
-      <w:pPr/>
       <w:r>
-        <w:rPr>
-          <w:i w:val="0"/>
-        </w:rPr>
-        <w:t>El objetivo de este documento es formalizar la decisión tecnológica adoptada por el equipo para el desarrollo del prototipo 3D del trabajo práctico “¿Me quedo o me voy?”, a partir de la investigación comparativa realizada durante el Sprint 1 y de las primeras validaciones prácticas efectuadas por el grupo.</w:t>
+        <w:t>El objetivo de este documento es formalizar la decisión tecnológica adoptada por el equipo para el desarrollo del prototipo 3D del trabajo práctico “¿Me quedo o me voy?”, a partir de la investigación comp</w:t>
+      </w:r>
+      <w:r>
+        <w:t>arativa realizada durante el Sprint 1 y de las primeras validaciones prácticas efectuadas por el grupo.</w:t>
       </w:r>
     </w:p>
     <w:p>
-      <w:pPr/>
       <w:r>
-        <w:rPr>
-          <w:i w:val="0"/>
-        </w:rPr>
-        <w:t>La decisión busca reducir la incertidumbre técnica antes de comenzar la construcción del núcleo del producto y dejar registrados los criterios utilizados, las alternativas consideradas, los motivos de descarte y las condiciones bajo las cuales la elección podría revisarse.</w:t>
+        <w:t xml:space="preserve">La decisión busca reducir la incertidumbre técnica antes de comenzar la construcción del núcleo del producto y dejar registrados los criterios </w:t>
+      </w:r>
+      <w:r>
+        <w:t>utilizados, las alternativas consideradas, los motivos de descarte y las condiciones bajo las cuales la elección podría revisarse.</w:t>
       </w:r>
     </w:p>
     <w:p>
@@ -474,29 +474,26 @@
       </w:r>
     </w:p>
     <w:p>
-      <w:pPr/>
       <w:r>
-        <w:rPr>
-          <w:i w:val="0"/>
-        </w:rPr>
-        <w:t>El trabajo práctico requiere construir un prototipo 3D en primera persona orientado a experimentar con movimiento, gravedad, colisiones, superficies, obstáculos y elementos físicos o interactivos. En etapas posteriores el prototipo deberá permitir que al menos dos jugadores compartan una misma partida, manteniendo sincronizados los estados relevantes de los personajes.</w:t>
+        <w:t>El trabajo práctico requiere construir un prototipo 3D en primera persona orientado a experimentar</w:t>
+      </w:r>
+      <w:r>
+        <w:t xml:space="preserve"> con movimiento, gravedad, colisiones, superficies, obstáculos y elementos físicos o interactivos. En etapas posteriores el prototipo deberá permitir que al menos dos jugadores compartan una misma partida, manteniendo sincronizados los estados relevantes d</w:t>
+      </w:r>
+      <w:r>
+        <w:t>e los personajes.</w:t>
       </w:r>
     </w:p>
     <w:p>
-      <w:pPr/>
       <w:r>
-        <w:rPr>
-          <w:i w:val="0"/>
-        </w:rPr>
-        <w:t>La investigación tecnológica previa comparó Unreal Engine, Unity y Godot Engine. Las tres alternativas resultaron técnicamente viables, aunque presentan diferencias en integración de herramientas, programación visual, costo de aprendizaje y complejidad para abordar el multiplayer.</w:t>
+        <w:t>La investigación tecnológica previa comparó Unreal Engine, Unity y Godot Engine. Las tres alternativas resultaron técnicamente viables, aunque presentan diferencias en integración de herramientas, programación visual, costo de aprendizaje</w:t>
+      </w:r>
+      <w:r>
+        <w:t xml:space="preserve"> y complejidad para abordar el multiplayer.</w:t>
       </w:r>
     </w:p>
     <w:p>
-      <w:pPr/>
       <w:r>
-        <w:rPr>
-          <w:i w:val="0"/>
-        </w:rPr>
         <w:t>Además de la comparación técnica, para la decisión se tuvieron en cuenta las condiciones concretas del equipo:</w:t>
       </w:r>
     </w:p>
@@ -513,7 +510,13 @@
         <w:spacing w:after="40"/>
       </w:pPr>
       <w:r>
-        <w:t>• Uno de los integrantes posee experiencia previa con Unreal Engine y Blueprints, lo que reduce parcialmente el costo de aprendizaje inicial. Además, existe experiencia previa con Godot Engine dentro del equipo, por lo que este motor también representa una alternativa conocida en caso de ser necesario reconsiderar la elección.</w:t>
+        <w:t>• Un</w:t>
+      </w:r>
+      <w:r>
+        <w:t>o de los integrantes posee experiencia previa con Unreal Engine y Blueprints, lo que reduce parcialmente el costo de aprendizaje inicial. Además, existe experiencia previa con Godot Engine dentro del equipo, por lo que este motor también representa una alt</w:t>
+      </w:r>
+      <w:r>
+        <w:t>ernativa conocida en caso de ser necesario reconsiderar la elección.</w:t>
       </w:r>
     </w:p>
     <w:p>
@@ -529,7 +532,10 @@
         <w:spacing w:after="40"/>
       </w:pPr>
       <w:r>
-        <w:t>• La disponibilidad de tiempo del equipo durante el Sprint 1 y las semanas siguientes no se considera, en principio, una restricción crítica.</w:t>
+        <w:t>• La disponibilidad de t</w:t>
+      </w:r>
+      <w:r>
+        <w:t>iempo del equipo durante el Sprint 1 y las semanas siguientes no se considera, en principio, una restricción crítica.</w:t>
       </w:r>
     </w:p>
     <w:p>
@@ -537,7 +543,10 @@
         <w:spacing w:after="40"/>
       </w:pPr>
       <w:r>
-        <w:t>• Como validación inicial se creó y ejecutó un proyecto basado en la plantilla First Person de Unreal Engine. La prueba permitió comprobar el funcionamiento del entorno y disponer rápidamente de una base de primera persona sobre la cual continuar experimentando. Esta prueba todavía no valida el multiplayer ni el alcance completo del TP.</w:t>
+        <w:t>• Como validación inicial se creó y ejecutó un proyecto basado en la plantilla First Person de Unreal Engine. La prueba permitió comprobar</w:t>
+      </w:r>
+      <w:r>
+        <w:t xml:space="preserve"> el funcionamiento del entorno y disponer rápidamente de una base de primera persona sobre la cual continuar experimentando. Esta prueba todavía no valida el multiplayer ni el alcance completo del TP.</w:t>
       </w:r>
     </w:p>
     <w:p>
@@ -549,43 +558,43 @@
       </w:r>
     </w:p>
     <w:p>
-      <w:pPr/>
       <w:r>
-        <w:rPr>
-          <w:i w:val="0"/>
-        </w:rPr>
-        <w:t>La decisión se tomó sobre las tres alternativas analizadas en el documento “Investigación y comparación de alternativas tecnológicas”. El siguiente cuadro resume los factores que tuvieron mayor peso para el equipo.</w:t>
+        <w:t xml:space="preserve">La decisión se tomó </w:t>
+      </w:r>
+      <w:r>
+        <w:t>sobre las tres alternativas analizadas en el documento “Investigación y comparación de alternativas tecnológicas”. El siguiente cuadro resume los factores que tuvieron mayor peso para el equipo.</w:t>
       </w:r>
     </w:p>
     <w:tbl>
       <w:tblPr>
-        <w:tblW w:type="auto" w:w="0"/>
+        <w:tblW w:w="0" w:type="auto"/>
         <w:jc w:val="center"/>
         <w:tblLayout w:type="fixed"/>
-        <w:tblLook w:firstColumn="1" w:firstRow="1" w:lastColumn="0" w:lastRow="0" w:noHBand="0" w:noVBand="1" w:val="04A0"/>
+        <w:tblLook w:val="04A0" w:firstRow="1" w:lastRow="0" w:firstColumn="1" w:lastColumn="0" w:noHBand="0" w:noVBand="1"/>
       </w:tblPr>
       <w:tblGrid>
-        <w:gridCol w:w="2351"/>
-        <w:gridCol w:w="2351"/>
-        <w:gridCol w:w="2351"/>
-        <w:gridCol w:w="2351"/>
+        <w:gridCol w:w="2952"/>
+        <w:gridCol w:w="2520"/>
+        <w:gridCol w:w="2520"/>
+        <w:gridCol w:w="2520"/>
       </w:tblGrid>
       <w:tr>
         <w:trPr>
           <w:cantSplit/>
-          <w:tblHeader w:val="true"/>
+          <w:tblHeader/>
+          <w:jc w:val="center"/>
         </w:trPr>
         <w:tc>
           <w:tcPr>
-            <w:tcW w:type="dxa" w:w="2952"/>
-            <w:vAlign w:val="center"/>
+            <w:tcW w:w="2952" w:type="dxa"/>
+            <w:shd w:val="clear" w:color="auto" w:fill="1F4E79"/>
             <w:tcMar>
               <w:top w:w="80" w:type="dxa"/>
               <w:left w:w="85" w:type="dxa"/>
               <w:bottom w:w="80" w:type="dxa"/>
               <w:right w:w="85" w:type="dxa"/>
             </w:tcMar>
-            <w:shd w:val="clear" w:color="auto" w:fill="1F4E79"/>
+            <w:vAlign w:val="center"/>
           </w:tcPr>
           <w:p>
             <w:pPr>
@@ -597,21 +606,22 @@
                 <w:color w:val="FFFFFF"/>
                 <w:sz w:val="18"/>
               </w:rPr>
+              <w:lastRenderedPageBreak/>
               <w:t>Criterio</w:t>
             </w:r>
           </w:p>
         </w:tc>
         <w:tc>
           <w:tcPr>
-            <w:tcW w:type="dxa" w:w="2520"/>
-            <w:vAlign w:val="center"/>
+            <w:tcW w:w="2520" w:type="dxa"/>
+            <w:shd w:val="clear" w:color="auto" w:fill="1F4E79"/>
             <w:tcMar>
               <w:top w:w="80" w:type="dxa"/>
               <w:left w:w="85" w:type="dxa"/>
               <w:bottom w:w="80" w:type="dxa"/>
               <w:right w:w="85" w:type="dxa"/>
             </w:tcMar>
-            <w:shd w:val="clear" w:color="auto" w:fill="1F4E79"/>
+            <w:vAlign w:val="center"/>
           </w:tcPr>
           <w:p>
             <w:pPr>
@@ -629,15 +639,15 @@
         </w:tc>
         <w:tc>
           <w:tcPr>
-            <w:tcW w:type="dxa" w:w="2520"/>
-            <w:vAlign w:val="center"/>
+            <w:tcW w:w="2520" w:type="dxa"/>
+            <w:shd w:val="clear" w:color="auto" w:fill="1F4E79"/>
             <w:tcMar>
               <w:top w:w="80" w:type="dxa"/>
               <w:left w:w="85" w:type="dxa"/>
               <w:bottom w:w="80" w:type="dxa"/>
               <w:right w:w="85" w:type="dxa"/>
             </w:tcMar>
-            <w:shd w:val="clear" w:color="auto" w:fill="1F4E79"/>
+            <w:vAlign w:val="center"/>
           </w:tcPr>
           <w:p>
             <w:pPr>
@@ -655,15 +665,15 @@
         </w:tc>
         <w:tc>
           <w:tcPr>
-            <w:tcW w:type="dxa" w:w="2520"/>
-            <w:vAlign w:val="center"/>
+            <w:tcW w:w="2520" w:type="dxa"/>
+            <w:shd w:val="clear" w:color="auto" w:fill="1F4E79"/>
             <w:tcMar>
               <w:top w:w="80" w:type="dxa"/>
               <w:left w:w="85" w:type="dxa"/>
               <w:bottom w:w="80" w:type="dxa"/>
               <w:right w:w="85" w:type="dxa"/>
             </w:tcMar>
-            <w:shd w:val="clear" w:color="auto" w:fill="1F4E79"/>
+            <w:vAlign w:val="center"/>
           </w:tcPr>
           <w:p>
             <w:pPr>
@@ -683,18 +693,19 @@
       <w:tr>
         <w:trPr>
           <w:cantSplit/>
+          <w:jc w:val="center"/>
         </w:trPr>
         <w:tc>
           <w:tcPr>
-            <w:tcW w:type="dxa" w:w="2952"/>
-            <w:vAlign w:val="center"/>
+            <w:tcW w:w="2952" w:type="dxa"/>
+            <w:shd w:val="clear" w:color="auto" w:fill="F3F6FA"/>
             <w:tcMar>
               <w:top w:w="80" w:type="dxa"/>
               <w:left w:w="85" w:type="dxa"/>
               <w:bottom w:w="80" w:type="dxa"/>
               <w:right w:w="85" w:type="dxa"/>
             </w:tcMar>
-            <w:shd w:val="clear" w:color="auto" w:fill="F3F6FA"/>
+            <w:vAlign w:val="center"/>
           </w:tcPr>
           <w:p>
             <w:pPr>
@@ -711,15 +722,45 @@
         </w:tc>
         <w:tc>
           <w:tcPr>
-            <w:tcW w:type="dxa" w:w="2520"/>
-            <w:vAlign w:val="center"/>
+            <w:tcW w:w="2520" w:type="dxa"/>
+            <w:shd w:val="clear" w:color="auto" w:fill="F3F6FA"/>
             <w:tcMar>
               <w:top w:w="80" w:type="dxa"/>
               <w:left w:w="85" w:type="dxa"/>
               <w:bottom w:w="80" w:type="dxa"/>
               <w:right w:w="85" w:type="dxa"/>
             </w:tcMar>
+            <w:vAlign w:val="center"/>
+          </w:tcPr>
+          <w:p>
+            <w:pPr>
+              <w:spacing w:after="0" w:line="240" w:lineRule="auto"/>
+            </w:pPr>
+            <w:r>
+              <w:rPr>
+                <w:sz w:val="18"/>
+              </w:rPr>
+              <w:t>Muy a</w:t>
+            </w:r>
+            <w:r>
+              <w:rPr>
+                <w:sz w:val="18"/>
+              </w:rPr>
+              <w:t>lta</w:t>
+            </w:r>
+          </w:p>
+        </w:tc>
+        <w:tc>
+          <w:tcPr>
+            <w:tcW w:w="2520" w:type="dxa"/>
             <w:shd w:val="clear" w:color="auto" w:fill="F3F6FA"/>
+            <w:tcMar>
+              <w:top w:w="80" w:type="dxa"/>
+              <w:left w:w="85" w:type="dxa"/>
+              <w:bottom w:w="80" w:type="dxa"/>
+              <w:right w:w="85" w:type="dxa"/>
+            </w:tcMar>
+            <w:vAlign w:val="center"/>
           </w:tcPr>
           <w:p>
             <w:pPr>
@@ -735,39 +776,15 @@
         </w:tc>
         <w:tc>
           <w:tcPr>
-            <w:tcW w:type="dxa" w:w="2520"/>
-            <w:vAlign w:val="center"/>
+            <w:tcW w:w="2520" w:type="dxa"/>
+            <w:shd w:val="clear" w:color="auto" w:fill="F3F6FA"/>
             <w:tcMar>
               <w:top w:w="80" w:type="dxa"/>
               <w:left w:w="85" w:type="dxa"/>
               <w:bottom w:w="80" w:type="dxa"/>
               <w:right w:w="85" w:type="dxa"/>
             </w:tcMar>
-            <w:shd w:val="clear" w:color="auto" w:fill="F3F6FA"/>
-          </w:tcPr>
-          <w:p>
-            <w:pPr>
-              <w:spacing w:after="0" w:line="240" w:lineRule="auto"/>
-            </w:pPr>
-            <w:r>
-              <w:rPr>
-                <w:sz w:val="18"/>
-              </w:rPr>
-              <w:t>Muy alta</w:t>
-            </w:r>
-          </w:p>
-        </w:tc>
-        <w:tc>
-          <w:tcPr>
-            <w:tcW w:type="dxa" w:w="2520"/>
             <w:vAlign w:val="center"/>
-            <w:tcMar>
-              <w:top w:w="80" w:type="dxa"/>
-              <w:left w:w="85" w:type="dxa"/>
-              <w:bottom w:w="80" w:type="dxa"/>
-              <w:right w:w="85" w:type="dxa"/>
-            </w:tcMar>
-            <w:shd w:val="clear" w:color="auto" w:fill="F3F6FA"/>
           </w:tcPr>
           <w:p>
             <w:pPr>
@@ -785,18 +802,19 @@
       <w:tr>
         <w:trPr>
           <w:cantSplit/>
+          <w:jc w:val="center"/>
         </w:trPr>
         <w:tc>
           <w:tcPr>
-            <w:tcW w:type="dxa" w:w="2952"/>
-            <w:vAlign w:val="center"/>
+            <w:tcW w:w="2952" w:type="dxa"/>
+            <w:shd w:val="clear" w:color="auto" w:fill="FFFFFF"/>
             <w:tcMar>
               <w:top w:w="80" w:type="dxa"/>
               <w:left w:w="85" w:type="dxa"/>
               <w:bottom w:w="80" w:type="dxa"/>
               <w:right w:w="85" w:type="dxa"/>
             </w:tcMar>
-            <w:shd w:val="clear" w:color="auto" w:fill="FFFFFF"/>
+            <w:vAlign w:val="center"/>
           </w:tcPr>
           <w:p>
             <w:pPr>
@@ -813,15 +831,15 @@
         </w:tc>
         <w:tc>
           <w:tcPr>
-            <w:tcW w:type="dxa" w:w="2520"/>
-            <w:vAlign w:val="center"/>
+            <w:tcW w:w="2520" w:type="dxa"/>
+            <w:shd w:val="clear" w:color="auto" w:fill="FFFFFF"/>
             <w:tcMar>
               <w:top w:w="80" w:type="dxa"/>
               <w:left w:w="85" w:type="dxa"/>
               <w:bottom w:w="80" w:type="dxa"/>
               <w:right w:w="85" w:type="dxa"/>
             </w:tcMar>
-            <w:shd w:val="clear" w:color="auto" w:fill="FFFFFF"/>
+            <w:vAlign w:val="center"/>
           </w:tcPr>
           <w:p>
             <w:pPr>
@@ -837,15 +855,15 @@
         </w:tc>
         <w:tc>
           <w:tcPr>
-            <w:tcW w:type="dxa" w:w="2520"/>
-            <w:vAlign w:val="center"/>
+            <w:tcW w:w="2520" w:type="dxa"/>
+            <w:shd w:val="clear" w:color="auto" w:fill="FFFFFF"/>
             <w:tcMar>
               <w:top w:w="80" w:type="dxa"/>
               <w:left w:w="85" w:type="dxa"/>
               <w:bottom w:w="80" w:type="dxa"/>
               <w:right w:w="85" w:type="dxa"/>
             </w:tcMar>
-            <w:shd w:val="clear" w:color="auto" w:fill="FFFFFF"/>
+            <w:vAlign w:val="center"/>
           </w:tcPr>
           <w:p>
             <w:pPr>
@@ -861,15 +879,15 @@
         </w:tc>
         <w:tc>
           <w:tcPr>
-            <w:tcW w:type="dxa" w:w="2520"/>
-            <w:vAlign w:val="center"/>
+            <w:tcW w:w="2520" w:type="dxa"/>
+            <w:shd w:val="clear" w:color="auto" w:fill="FFFFFF"/>
             <w:tcMar>
               <w:top w:w="80" w:type="dxa"/>
               <w:left w:w="85" w:type="dxa"/>
               <w:bottom w:w="80" w:type="dxa"/>
               <w:right w:w="85" w:type="dxa"/>
             </w:tcMar>
-            <w:shd w:val="clear" w:color="auto" w:fill="FFFFFF"/>
+            <w:vAlign w:val="center"/>
           </w:tcPr>
           <w:p>
             <w:pPr>
@@ -887,18 +905,19 @@
       <w:tr>
         <w:trPr>
           <w:cantSplit/>
+          <w:jc w:val="center"/>
         </w:trPr>
         <w:tc>
           <w:tcPr>
-            <w:tcW w:type="dxa" w:w="2952"/>
-            <w:vAlign w:val="center"/>
+            <w:tcW w:w="2952" w:type="dxa"/>
+            <w:shd w:val="clear" w:color="auto" w:fill="F3F6FA"/>
             <w:tcMar>
               <w:top w:w="80" w:type="dxa"/>
               <w:left w:w="85" w:type="dxa"/>
               <w:bottom w:w="80" w:type="dxa"/>
               <w:right w:w="85" w:type="dxa"/>
             </w:tcMar>
-            <w:shd w:val="clear" w:color="auto" w:fill="F3F6FA"/>
+            <w:vAlign w:val="center"/>
           </w:tcPr>
           <w:p>
             <w:pPr>
@@ -915,15 +934,15 @@
         </w:tc>
         <w:tc>
           <w:tcPr>
-            <w:tcW w:type="dxa" w:w="2520"/>
-            <w:vAlign w:val="center"/>
+            <w:tcW w:w="2520" w:type="dxa"/>
+            <w:shd w:val="clear" w:color="auto" w:fill="F3F6FA"/>
             <w:tcMar>
               <w:top w:w="80" w:type="dxa"/>
               <w:left w:w="85" w:type="dxa"/>
               <w:bottom w:w="80" w:type="dxa"/>
               <w:right w:w="85" w:type="dxa"/>
             </w:tcMar>
-            <w:shd w:val="clear" w:color="auto" w:fill="F3F6FA"/>
+            <w:vAlign w:val="center"/>
           </w:tcPr>
           <w:p>
             <w:pPr>
@@ -939,15 +958,15 @@
         </w:tc>
         <w:tc>
           <w:tcPr>
-            <w:tcW w:type="dxa" w:w="2520"/>
-            <w:vAlign w:val="center"/>
+            <w:tcW w:w="2520" w:type="dxa"/>
+            <w:shd w:val="clear" w:color="auto" w:fill="F3F6FA"/>
             <w:tcMar>
               <w:top w:w="80" w:type="dxa"/>
               <w:left w:w="85" w:type="dxa"/>
               <w:bottom w:w="80" w:type="dxa"/>
               <w:right w:w="85" w:type="dxa"/>
             </w:tcMar>
-            <w:shd w:val="clear" w:color="auto" w:fill="F3F6FA"/>
+            <w:vAlign w:val="center"/>
           </w:tcPr>
           <w:p>
             <w:pPr>
@@ -963,15 +982,15 @@
         </w:tc>
         <w:tc>
           <w:tcPr>
-            <w:tcW w:type="dxa" w:w="2520"/>
-            <w:vAlign w:val="center"/>
+            <w:tcW w:w="2520" w:type="dxa"/>
+            <w:shd w:val="clear" w:color="auto" w:fill="F3F6FA"/>
             <w:tcMar>
               <w:top w:w="80" w:type="dxa"/>
               <w:left w:w="85" w:type="dxa"/>
               <w:bottom w:w="80" w:type="dxa"/>
               <w:right w:w="85" w:type="dxa"/>
             </w:tcMar>
-            <w:shd w:val="clear" w:color="auto" w:fill="F3F6FA"/>
+            <w:vAlign w:val="center"/>
           </w:tcPr>
           <w:p>
             <w:pPr>
@@ -989,18 +1008,19 @@
       <w:tr>
         <w:trPr>
           <w:cantSplit/>
+          <w:jc w:val="center"/>
         </w:trPr>
         <w:tc>
           <w:tcPr>
-            <w:tcW w:type="dxa" w:w="2952"/>
-            <w:vAlign w:val="center"/>
+            <w:tcW w:w="2952" w:type="dxa"/>
+            <w:shd w:val="clear" w:color="auto" w:fill="FFFFFF"/>
             <w:tcMar>
               <w:top w:w="80" w:type="dxa"/>
               <w:left w:w="85" w:type="dxa"/>
               <w:bottom w:w="80" w:type="dxa"/>
               <w:right w:w="85" w:type="dxa"/>
             </w:tcMar>
-            <w:shd w:val="clear" w:color="auto" w:fill="FFFFFF"/>
+            <w:vAlign w:val="center"/>
           </w:tcPr>
           <w:p>
             <w:pPr>
@@ -1017,15 +1037,15 @@
         </w:tc>
         <w:tc>
           <w:tcPr>
-            <w:tcW w:type="dxa" w:w="2520"/>
-            <w:vAlign w:val="center"/>
+            <w:tcW w:w="2520" w:type="dxa"/>
+            <w:shd w:val="clear" w:color="auto" w:fill="FFFFFF"/>
             <w:tcMar>
               <w:top w:w="80" w:type="dxa"/>
               <w:left w:w="85" w:type="dxa"/>
               <w:bottom w:w="80" w:type="dxa"/>
               <w:right w:w="85" w:type="dxa"/>
             </w:tcMar>
-            <w:shd w:val="clear" w:color="auto" w:fill="FFFFFF"/>
+            <w:vAlign w:val="center"/>
           </w:tcPr>
           <w:p>
             <w:pPr>
@@ -1041,15 +1061,15 @@
         </w:tc>
         <w:tc>
           <w:tcPr>
-            <w:tcW w:type="dxa" w:w="2520"/>
-            <w:vAlign w:val="center"/>
+            <w:tcW w:w="2520" w:type="dxa"/>
+            <w:shd w:val="clear" w:color="auto" w:fill="FFFFFF"/>
             <w:tcMar>
               <w:top w:w="80" w:type="dxa"/>
               <w:left w:w="85" w:type="dxa"/>
               <w:bottom w:w="80" w:type="dxa"/>
               <w:right w:w="85" w:type="dxa"/>
             </w:tcMar>
-            <w:shd w:val="clear" w:color="auto" w:fill="FFFFFF"/>
+            <w:vAlign w:val="center"/>
           </w:tcPr>
           <w:p>
             <w:pPr>
@@ -1065,15 +1085,15 @@
         </w:tc>
         <w:tc>
           <w:tcPr>
-            <w:tcW w:type="dxa" w:w="2520"/>
-            <w:vAlign w:val="center"/>
+            <w:tcW w:w="2520" w:type="dxa"/>
+            <w:shd w:val="clear" w:color="auto" w:fill="FFFFFF"/>
             <w:tcMar>
               <w:top w:w="80" w:type="dxa"/>
               <w:left w:w="85" w:type="dxa"/>
               <w:bottom w:w="80" w:type="dxa"/>
               <w:right w:w="85" w:type="dxa"/>
             </w:tcMar>
-            <w:shd w:val="clear" w:color="auto" w:fill="FFFFFF"/>
+            <w:vAlign w:val="center"/>
           </w:tcPr>
           <w:p>
             <w:pPr>
@@ -1091,18 +1111,19 @@
       <w:tr>
         <w:trPr>
           <w:cantSplit/>
+          <w:jc w:val="center"/>
         </w:trPr>
         <w:tc>
           <w:tcPr>
-            <w:tcW w:type="dxa" w:w="2952"/>
-            <w:vAlign w:val="center"/>
+            <w:tcW w:w="2952" w:type="dxa"/>
+            <w:shd w:val="clear" w:color="auto" w:fill="F3F6FA"/>
             <w:tcMar>
               <w:top w:w="80" w:type="dxa"/>
               <w:left w:w="85" w:type="dxa"/>
               <w:bottom w:w="80" w:type="dxa"/>
               <w:right w:w="85" w:type="dxa"/>
             </w:tcMar>
-            <w:shd w:val="clear" w:color="auto" w:fill="F3F6FA"/>
+            <w:vAlign w:val="center"/>
           </w:tcPr>
           <w:p>
             <w:pPr>
@@ -1119,15 +1140,15 @@
         </w:tc>
         <w:tc>
           <w:tcPr>
-            <w:tcW w:type="dxa" w:w="2520"/>
-            <w:vAlign w:val="center"/>
+            <w:tcW w:w="2520" w:type="dxa"/>
+            <w:shd w:val="clear" w:color="auto" w:fill="F3F6FA"/>
             <w:tcMar>
               <w:top w:w="80" w:type="dxa"/>
               <w:left w:w="85" w:type="dxa"/>
               <w:bottom w:w="80" w:type="dxa"/>
               <w:right w:w="85" w:type="dxa"/>
             </w:tcMar>
-            <w:shd w:val="clear" w:color="auto" w:fill="F3F6FA"/>
+            <w:vAlign w:val="center"/>
           </w:tcPr>
           <w:p>
             <w:pPr>
@@ -1143,15 +1164,15 @@
         </w:tc>
         <w:tc>
           <w:tcPr>
-            <w:tcW w:type="dxa" w:w="2520"/>
-            <w:vAlign w:val="center"/>
+            <w:tcW w:w="2520" w:type="dxa"/>
+            <w:shd w:val="clear" w:color="auto" w:fill="F3F6FA"/>
             <w:tcMar>
               <w:top w:w="80" w:type="dxa"/>
               <w:left w:w="85" w:type="dxa"/>
               <w:bottom w:w="80" w:type="dxa"/>
               <w:right w:w="85" w:type="dxa"/>
             </w:tcMar>
-            <w:shd w:val="clear" w:color="auto" w:fill="F3F6FA"/>
+            <w:vAlign w:val="center"/>
           </w:tcPr>
           <w:p>
             <w:pPr>
@@ -1167,18 +1188,17 @@
         </w:tc>
         <w:tc>
           <w:tcPr>
-            <w:tcW w:type="dxa" w:w="2520"/>
-            <w:vAlign w:val="center"/>
+            <w:tcW w:w="2520" w:type="dxa"/>
+            <w:shd w:val="clear" w:color="auto" w:fill="F3F6FA"/>
             <w:tcMar>
               <w:top w:w="80" w:type="dxa"/>
               <w:left w:w="85" w:type="dxa"/>
               <w:bottom w:w="80" w:type="dxa"/>
               <w:right w:w="85" w:type="dxa"/>
             </w:tcMar>
-            <w:shd w:val="clear" w:color="auto" w:fill="F3F6FA"/>
+            <w:vAlign w:val="center"/>
           </w:tcPr>
           <w:p>
-            <w:pPr/>
             <w:r>
               <w:rPr>
                 <w:sz w:val="18"/>
@@ -1191,18 +1211,19 @@
       <w:tr>
         <w:trPr>
           <w:cantSplit/>
+          <w:jc w:val="center"/>
         </w:trPr>
         <w:tc>
           <w:tcPr>
-            <w:tcW w:type="dxa" w:w="2952"/>
-            <w:vAlign w:val="center"/>
+            <w:tcW w:w="2952" w:type="dxa"/>
+            <w:shd w:val="clear" w:color="auto" w:fill="FFFFFF"/>
             <w:tcMar>
               <w:top w:w="80" w:type="dxa"/>
               <w:left w:w="85" w:type="dxa"/>
               <w:bottom w:w="80" w:type="dxa"/>
               <w:right w:w="85" w:type="dxa"/>
             </w:tcMar>
-            <w:shd w:val="clear" w:color="auto" w:fill="FFFFFF"/>
+            <w:vAlign w:val="center"/>
           </w:tcPr>
           <w:p>
             <w:pPr>
@@ -1213,21 +1234,28 @@
                 <w:b/>
                 <w:sz w:val="18"/>
               </w:rPr>
-              <w:t>Prueba de concepto realizada</w:t>
+              <w:t xml:space="preserve">Prueba de concepto </w:t>
+            </w:r>
+            <w:r>
+              <w:rPr>
+                <w:b/>
+                <w:sz w:val="18"/>
+              </w:rPr>
+              <w:t>realizada</w:t>
             </w:r>
           </w:p>
         </w:tc>
         <w:tc>
           <w:tcPr>
-            <w:tcW w:type="dxa" w:w="2520"/>
-            <w:vAlign w:val="center"/>
+            <w:tcW w:w="2520" w:type="dxa"/>
+            <w:shd w:val="clear" w:color="auto" w:fill="FFFFFF"/>
             <w:tcMar>
               <w:top w:w="80" w:type="dxa"/>
               <w:left w:w="85" w:type="dxa"/>
               <w:bottom w:w="80" w:type="dxa"/>
               <w:right w:w="85" w:type="dxa"/>
             </w:tcMar>
-            <w:shd w:val="clear" w:color="auto" w:fill="FFFFFF"/>
+            <w:vAlign w:val="center"/>
           </w:tcPr>
           <w:p>
             <w:pPr>
@@ -1243,15 +1271,15 @@
         </w:tc>
         <w:tc>
           <w:tcPr>
-            <w:tcW w:type="dxa" w:w="2520"/>
-            <w:vAlign w:val="center"/>
+            <w:tcW w:w="2520" w:type="dxa"/>
+            <w:shd w:val="clear" w:color="auto" w:fill="FFFFFF"/>
             <w:tcMar>
               <w:top w:w="80" w:type="dxa"/>
               <w:left w:w="85" w:type="dxa"/>
               <w:bottom w:w="80" w:type="dxa"/>
               <w:right w:w="85" w:type="dxa"/>
             </w:tcMar>
-            <w:shd w:val="clear" w:color="auto" w:fill="FFFFFF"/>
+            <w:vAlign w:val="center"/>
           </w:tcPr>
           <w:p>
             <w:pPr>
@@ -1267,15 +1295,15 @@
         </w:tc>
         <w:tc>
           <w:tcPr>
-            <w:tcW w:type="dxa" w:w="2520"/>
-            <w:vAlign w:val="center"/>
+            <w:tcW w:w="2520" w:type="dxa"/>
+            <w:shd w:val="clear" w:color="auto" w:fill="FFFFFF"/>
             <w:tcMar>
               <w:top w:w="80" w:type="dxa"/>
               <w:left w:w="85" w:type="dxa"/>
               <w:bottom w:w="80" w:type="dxa"/>
               <w:right w:w="85" w:type="dxa"/>
             </w:tcMar>
-            <w:shd w:val="clear" w:color="auto" w:fill="FFFFFF"/>
+            <w:vAlign w:val="center"/>
           </w:tcPr>
           <w:p>
             <w:pPr>
@@ -1293,18 +1321,19 @@
       <w:tr>
         <w:trPr>
           <w:cantSplit/>
+          <w:jc w:val="center"/>
         </w:trPr>
         <w:tc>
           <w:tcPr>
-            <w:tcW w:type="dxa" w:w="2952"/>
-            <w:vAlign w:val="center"/>
+            <w:tcW w:w="2952" w:type="dxa"/>
+            <w:shd w:val="clear" w:color="auto" w:fill="F3F6FA"/>
             <w:tcMar>
               <w:top w:w="80" w:type="dxa"/>
               <w:left w:w="85" w:type="dxa"/>
               <w:bottom w:w="80" w:type="dxa"/>
               <w:right w:w="85" w:type="dxa"/>
             </w:tcMar>
-            <w:shd w:val="clear" w:color="auto" w:fill="F3F6FA"/>
+            <w:vAlign w:val="center"/>
           </w:tcPr>
           <w:p>
             <w:pPr>
@@ -1321,15 +1350,15 @@
         </w:tc>
         <w:tc>
           <w:tcPr>
-            <w:tcW w:type="dxa" w:w="2520"/>
-            <w:vAlign w:val="center"/>
+            <w:tcW w:w="2520" w:type="dxa"/>
+            <w:shd w:val="clear" w:color="auto" w:fill="F3F6FA"/>
             <w:tcMar>
               <w:top w:w="80" w:type="dxa"/>
               <w:left w:w="85" w:type="dxa"/>
               <w:bottom w:w="80" w:type="dxa"/>
               <w:right w:w="85" w:type="dxa"/>
             </w:tcMar>
-            <w:shd w:val="clear" w:color="auto" w:fill="F3F6FA"/>
+            <w:vAlign w:val="center"/>
           </w:tcPr>
           <w:p>
             <w:pPr>
@@ -1345,15 +1374,15 @@
         </w:tc>
         <w:tc>
           <w:tcPr>
-            <w:tcW w:type="dxa" w:w="2520"/>
-            <w:vAlign w:val="center"/>
+            <w:tcW w:w="2520" w:type="dxa"/>
+            <w:shd w:val="clear" w:color="auto" w:fill="F3F6FA"/>
             <w:tcMar>
               <w:top w:w="80" w:type="dxa"/>
               <w:left w:w="85" w:type="dxa"/>
               <w:bottom w:w="80" w:type="dxa"/>
               <w:right w:w="85" w:type="dxa"/>
             </w:tcMar>
-            <w:shd w:val="clear" w:color="auto" w:fill="F3F6FA"/>
+            <w:vAlign w:val="center"/>
           </w:tcPr>
           <w:p>
             <w:pPr>
@@ -1369,18 +1398,17 @@
         </w:tc>
         <w:tc>
           <w:tcPr>
-            <w:tcW w:type="dxa" w:w="2520"/>
-            <w:vAlign w:val="center"/>
+            <w:tcW w:w="2520" w:type="dxa"/>
+            <w:shd w:val="clear" w:color="auto" w:fill="F3F6FA"/>
             <w:tcMar>
               <w:top w:w="80" w:type="dxa"/>
               <w:left w:w="85" w:type="dxa"/>
               <w:bottom w:w="80" w:type="dxa"/>
               <w:right w:w="85" w:type="dxa"/>
             </w:tcMar>
-            <w:shd w:val="clear" w:color="auto" w:fill="F3F6FA"/>
+            <w:vAlign w:val="center"/>
           </w:tcPr>
           <w:p>
-            <w:pPr/>
             <w:r>
               <w:rPr>
                 <w:sz w:val="18"/>
@@ -1393,18 +1421,19 @@
       <w:tr>
         <w:trPr>
           <w:cantSplit/>
+          <w:jc w:val="center"/>
         </w:trPr>
         <w:tc>
           <w:tcPr>
-            <w:tcW w:type="dxa" w:w="2952"/>
-            <w:vAlign w:val="center"/>
+            <w:tcW w:w="2952" w:type="dxa"/>
+            <w:shd w:val="clear" w:color="auto" w:fill="FFFFFF"/>
             <w:tcMar>
               <w:top w:w="80" w:type="dxa"/>
               <w:left w:w="85" w:type="dxa"/>
               <w:bottom w:w="80" w:type="dxa"/>
               <w:right w:w="85" w:type="dxa"/>
             </w:tcMar>
-            <w:shd w:val="clear" w:color="auto" w:fill="FFFFFF"/>
+            <w:vAlign w:val="center"/>
           </w:tcPr>
           <w:p>
             <w:pPr>
@@ -1415,21 +1444,28 @@
                 <w:b/>
                 <w:sz w:val="18"/>
               </w:rPr>
-              <w:t>Rol como alternativa</w:t>
+              <w:t xml:space="preserve">Rol como </w:t>
+            </w:r>
+            <w:r>
+              <w:rPr>
+                <w:b/>
+                <w:sz w:val="18"/>
+              </w:rPr>
+              <w:t>alternativa</w:t>
             </w:r>
           </w:p>
         </w:tc>
         <w:tc>
           <w:tcPr>
-            <w:tcW w:type="dxa" w:w="2520"/>
-            <w:vAlign w:val="center"/>
+            <w:tcW w:w="2520" w:type="dxa"/>
+            <w:shd w:val="clear" w:color="auto" w:fill="FFFFFF"/>
             <w:tcMar>
               <w:top w:w="80" w:type="dxa"/>
               <w:left w:w="85" w:type="dxa"/>
               <w:bottom w:w="80" w:type="dxa"/>
               <w:right w:w="85" w:type="dxa"/>
             </w:tcMar>
-            <w:shd w:val="clear" w:color="auto" w:fill="FFFFFF"/>
+            <w:vAlign w:val="center"/>
           </w:tcPr>
           <w:p>
             <w:pPr>
@@ -1445,15 +1481,15 @@
         </w:tc>
         <w:tc>
           <w:tcPr>
-            <w:tcW w:type="dxa" w:w="2520"/>
-            <w:vAlign w:val="center"/>
+            <w:tcW w:w="2520" w:type="dxa"/>
+            <w:shd w:val="clear" w:color="auto" w:fill="FFFFFF"/>
             <w:tcMar>
               <w:top w:w="80" w:type="dxa"/>
               <w:left w:w="85" w:type="dxa"/>
               <w:bottom w:w="80" w:type="dxa"/>
               <w:right w:w="85" w:type="dxa"/>
             </w:tcMar>
-            <w:shd w:val="clear" w:color="auto" w:fill="FFFFFF"/>
+            <w:vAlign w:val="center"/>
           </w:tcPr>
           <w:p>
             <w:pPr>
@@ -1469,15 +1505,15 @@
         </w:tc>
         <w:tc>
           <w:tcPr>
-            <w:tcW w:type="dxa" w:w="2520"/>
-            <w:vAlign w:val="center"/>
+            <w:tcW w:w="2520" w:type="dxa"/>
+            <w:shd w:val="clear" w:color="auto" w:fill="FFFFFF"/>
             <w:tcMar>
               <w:top w:w="80" w:type="dxa"/>
               <w:left w:w="85" w:type="dxa"/>
               <w:bottom w:w="80" w:type="dxa"/>
               <w:right w:w="85" w:type="dxa"/>
             </w:tcMar>
-            <w:shd w:val="clear" w:color="auto" w:fill="FFFFFF"/>
+            <w:vAlign w:val="center"/>
           </w:tcPr>
           <w:p>
             <w:pPr>
@@ -1502,50 +1538,46 @@
       </w:r>
     </w:p>
     <w:p>
-      <w:pPr/>
       <w:r>
-        <w:rPr>
-          <w:i w:val="0"/>
-        </w:rPr>
-        <w:t>El equipo decide utilizar Unreal Engine como motor de desarrollo para el proyecto, priorizando Blueprints como mecanismo principal para implementar la lógica de gameplay durante el prototipo.</w:t>
+        <w:t xml:space="preserve">El equipo decide utilizar Unreal Engine como motor de desarrollo para el proyecto, priorizando Blueprints como mecanismo principal para implementar la lógica de </w:t>
+      </w:r>
+      <w:r>
+        <w:t>gameplay durante el prototipo.</w:t>
       </w:r>
     </w:p>
     <w:p>
-      <w:pPr/>
       <w:r>
-        <w:rPr>
-          <w:i w:val="0"/>
-        </w:rPr>
         <w:t>La decisión técnica inicial queda definida de la siguiente manera:</w:t>
       </w:r>
     </w:p>
     <w:tbl>
       <w:tblPr>
-        <w:tblW w:type="auto" w:w="0"/>
+        <w:tblW w:w="0" w:type="auto"/>
         <w:jc w:val="center"/>
         <w:tblLayout w:type="fixed"/>
-        <w:tblLook w:firstColumn="1" w:firstRow="1" w:lastColumn="0" w:lastRow="0" w:noHBand="0" w:noVBand="1" w:val="04A0"/>
+        <w:tblLook w:val="04A0" w:firstRow="1" w:lastRow="0" w:firstColumn="1" w:lastColumn="0" w:noHBand="0" w:noVBand="1"/>
       </w:tblPr>
       <w:tblGrid>
-        <w:gridCol w:w="4703"/>
-        <w:gridCol w:w="4703"/>
+        <w:gridCol w:w="3240"/>
+        <w:gridCol w:w="7272"/>
       </w:tblGrid>
       <w:tr>
         <w:trPr>
           <w:cantSplit/>
-          <w:tblHeader w:val="true"/>
+          <w:tblHeader/>
+          <w:jc w:val="center"/>
         </w:trPr>
         <w:tc>
           <w:tcPr>
-            <w:tcW w:type="dxa" w:w="3240"/>
-            <w:vAlign w:val="center"/>
+            <w:tcW w:w="3240" w:type="dxa"/>
+            <w:shd w:val="clear" w:color="auto" w:fill="1F4E79"/>
             <w:tcMar>
               <w:top w:w="80" w:type="dxa"/>
               <w:left w:w="85" w:type="dxa"/>
               <w:bottom w:w="80" w:type="dxa"/>
               <w:right w:w="85" w:type="dxa"/>
             </w:tcMar>
-            <w:shd w:val="clear" w:color="auto" w:fill="1F4E79"/>
+            <w:vAlign w:val="center"/>
           </w:tcPr>
           <w:p>
             <w:pPr>
@@ -1563,15 +1595,15 @@
         </w:tc>
         <w:tc>
           <w:tcPr>
-            <w:tcW w:type="dxa" w:w="7272"/>
-            <w:vAlign w:val="center"/>
+            <w:tcW w:w="7272" w:type="dxa"/>
+            <w:shd w:val="clear" w:color="auto" w:fill="1F4E79"/>
             <w:tcMar>
               <w:top w:w="80" w:type="dxa"/>
               <w:left w:w="85" w:type="dxa"/>
               <w:bottom w:w="80" w:type="dxa"/>
               <w:right w:w="85" w:type="dxa"/>
             </w:tcMar>
-            <w:shd w:val="clear" w:color="auto" w:fill="1F4E79"/>
+            <w:vAlign w:val="center"/>
           </w:tcPr>
           <w:p>
             <w:pPr>
@@ -1591,18 +1623,19 @@
       <w:tr>
         <w:trPr>
           <w:cantSplit/>
+          <w:jc w:val="center"/>
         </w:trPr>
         <w:tc>
           <w:tcPr>
-            <w:tcW w:type="dxa" w:w="3240"/>
-            <w:vAlign w:val="center"/>
+            <w:tcW w:w="3240" w:type="dxa"/>
+            <w:shd w:val="clear" w:color="auto" w:fill="F3F6FA"/>
             <w:tcMar>
               <w:top w:w="80" w:type="dxa"/>
               <w:left w:w="85" w:type="dxa"/>
               <w:bottom w:w="80" w:type="dxa"/>
               <w:right w:w="85" w:type="dxa"/>
             </w:tcMar>
-            <w:shd w:val="clear" w:color="auto" w:fill="F3F6FA"/>
+            <w:vAlign w:val="center"/>
           </w:tcPr>
           <w:p>
             <w:pPr>
@@ -1619,15 +1652,15 @@
         </w:tc>
         <w:tc>
           <w:tcPr>
-            <w:tcW w:type="dxa" w:w="7272"/>
-            <w:vAlign w:val="center"/>
+            <w:tcW w:w="7272" w:type="dxa"/>
+            <w:shd w:val="clear" w:color="auto" w:fill="F3F6FA"/>
             <w:tcMar>
               <w:top w:w="80" w:type="dxa"/>
               <w:left w:w="85" w:type="dxa"/>
               <w:bottom w:w="80" w:type="dxa"/>
               <w:right w:w="85" w:type="dxa"/>
             </w:tcMar>
-            <w:shd w:val="clear" w:color="auto" w:fill="F3F6FA"/>
+            <w:vAlign w:val="center"/>
           </w:tcPr>
           <w:p>
             <w:pPr>
@@ -1645,18 +1678,19 @@
       <w:tr>
         <w:trPr>
           <w:cantSplit/>
+          <w:jc w:val="center"/>
         </w:trPr>
         <w:tc>
           <w:tcPr>
-            <w:tcW w:type="dxa" w:w="3240"/>
-            <w:vAlign w:val="center"/>
+            <w:tcW w:w="3240" w:type="dxa"/>
+            <w:shd w:val="clear" w:color="auto" w:fill="FFFFFF"/>
             <w:tcMar>
               <w:top w:w="80" w:type="dxa"/>
               <w:left w:w="85" w:type="dxa"/>
               <w:bottom w:w="80" w:type="dxa"/>
               <w:right w:w="85" w:type="dxa"/>
             </w:tcMar>
-            <w:shd w:val="clear" w:color="auto" w:fill="FFFFFF"/>
+            <w:vAlign w:val="center"/>
           </w:tcPr>
           <w:p>
             <w:pPr>
@@ -1673,15 +1707,15 @@
         </w:tc>
         <w:tc>
           <w:tcPr>
-            <w:tcW w:type="dxa" w:w="7272"/>
-            <w:vAlign w:val="center"/>
+            <w:tcW w:w="7272" w:type="dxa"/>
+            <w:shd w:val="clear" w:color="auto" w:fill="FFFFFF"/>
             <w:tcMar>
               <w:top w:w="80" w:type="dxa"/>
               <w:left w:w="85" w:type="dxa"/>
               <w:bottom w:w="80" w:type="dxa"/>
               <w:right w:w="85" w:type="dxa"/>
             </w:tcMar>
-            <w:shd w:val="clear" w:color="auto" w:fill="FFFFFF"/>
+            <w:vAlign w:val="center"/>
           </w:tcPr>
           <w:p>
             <w:pPr>
@@ -1691,7 +1725,13 @@
               <w:rPr>
                 <w:sz w:val="19"/>
               </w:rPr>
-              <w:t>Blueprints como alternativa principal. Se evitará incorporar C++ salvo que aparezca una necesidad concreta que lo justifique.</w:t>
+              <w:t xml:space="preserve">Blueprints como alternativa principal. Se evitará incorporar C++ salvo que </w:t>
+            </w:r>
+            <w:r>
+              <w:rPr>
+                <w:sz w:val="19"/>
+              </w:rPr>
+              <w:t>aparezca una necesidad concreta que lo justifique.</w:t>
             </w:r>
           </w:p>
         </w:tc>
@@ -1699,18 +1739,19 @@
       <w:tr>
         <w:trPr>
           <w:cantSplit/>
+          <w:jc w:val="center"/>
         </w:trPr>
         <w:tc>
           <w:tcPr>
-            <w:tcW w:type="dxa" w:w="3240"/>
-            <w:vAlign w:val="center"/>
+            <w:tcW w:w="3240" w:type="dxa"/>
+            <w:shd w:val="clear" w:color="auto" w:fill="F3F6FA"/>
             <w:tcMar>
               <w:top w:w="80" w:type="dxa"/>
               <w:left w:w="85" w:type="dxa"/>
               <w:bottom w:w="80" w:type="dxa"/>
               <w:right w:w="85" w:type="dxa"/>
             </w:tcMar>
-            <w:shd w:val="clear" w:color="auto" w:fill="F3F6FA"/>
+            <w:vAlign w:val="center"/>
           </w:tcPr>
           <w:p>
             <w:pPr>
@@ -1727,15 +1768,15 @@
         </w:tc>
         <w:tc>
           <w:tcPr>
-            <w:tcW w:type="dxa" w:w="7272"/>
-            <w:vAlign w:val="center"/>
+            <w:tcW w:w="7272" w:type="dxa"/>
+            <w:shd w:val="clear" w:color="auto" w:fill="F3F6FA"/>
             <w:tcMar>
               <w:top w:w="80" w:type="dxa"/>
               <w:left w:w="85" w:type="dxa"/>
               <w:bottom w:w="80" w:type="dxa"/>
               <w:right w:w="85" w:type="dxa"/>
             </w:tcMar>
-            <w:shd w:val="clear" w:color="auto" w:fill="F3F6FA"/>
+            <w:vAlign w:val="center"/>
           </w:tcPr>
           <w:p>
             <w:pPr>
@@ -1753,18 +1794,19 @@
       <w:tr>
         <w:trPr>
           <w:cantSplit/>
+          <w:jc w:val="center"/>
         </w:trPr>
         <w:tc>
           <w:tcPr>
-            <w:tcW w:type="dxa" w:w="3240"/>
-            <w:vAlign w:val="center"/>
+            <w:tcW w:w="3240" w:type="dxa"/>
+            <w:shd w:val="clear" w:color="auto" w:fill="FFFFFF"/>
             <w:tcMar>
               <w:top w:w="80" w:type="dxa"/>
               <w:left w:w="85" w:type="dxa"/>
               <w:bottom w:w="80" w:type="dxa"/>
               <w:right w:w="85" w:type="dxa"/>
             </w:tcMar>
-            <w:shd w:val="clear" w:color="auto" w:fill="FFFFFF"/>
+            <w:vAlign w:val="center"/>
           </w:tcPr>
           <w:p>
             <w:pPr>
@@ -1781,15 +1823,15 @@
         </w:tc>
         <w:tc>
           <w:tcPr>
-            <w:tcW w:type="dxa" w:w="7272"/>
-            <w:vAlign w:val="center"/>
+            <w:tcW w:w="7272" w:type="dxa"/>
+            <w:shd w:val="clear" w:color="auto" w:fill="FFFFFF"/>
             <w:tcMar>
               <w:top w:w="80" w:type="dxa"/>
               <w:left w:w="85" w:type="dxa"/>
               <w:bottom w:w="80" w:type="dxa"/>
               <w:right w:w="85" w:type="dxa"/>
             </w:tcMar>
-            <w:shd w:val="clear" w:color="auto" w:fill="FFFFFF"/>
+            <w:vAlign w:val="center"/>
           </w:tcPr>
           <w:p>
             <w:pPr>
@@ -1799,7 +1841,13 @@
               <w:rPr>
                 <w:sz w:val="19"/>
               </w:rPr>
-              <w:t>Chaos Physics para objetos que requieran simulación física; movimiento principal del jugador controlado mediante Character Movement.</w:t>
+              <w:t xml:space="preserve">Chaos Physics para objetos que requieran simulación física; movimiento principal del jugador controlado </w:t>
+            </w:r>
+            <w:r>
+              <w:rPr>
+                <w:sz w:val="19"/>
+              </w:rPr>
+              <w:t>mediante Character Movement.</w:t>
             </w:r>
           </w:p>
         </w:tc>
@@ -1807,18 +1855,19 @@
       <w:tr>
         <w:trPr>
           <w:cantSplit/>
+          <w:jc w:val="center"/>
         </w:trPr>
         <w:tc>
           <w:tcPr>
-            <w:tcW w:type="dxa" w:w="3240"/>
-            <w:vAlign w:val="center"/>
+            <w:tcW w:w="3240" w:type="dxa"/>
+            <w:shd w:val="clear" w:color="auto" w:fill="F3F6FA"/>
             <w:tcMar>
               <w:top w:w="80" w:type="dxa"/>
               <w:left w:w="85" w:type="dxa"/>
               <w:bottom w:w="80" w:type="dxa"/>
               <w:right w:w="85" w:type="dxa"/>
             </w:tcMar>
-            <w:shd w:val="clear" w:color="auto" w:fill="F3F6FA"/>
+            <w:vAlign w:val="center"/>
           </w:tcPr>
           <w:p>
             <w:pPr>
@@ -1835,15 +1884,15 @@
         </w:tc>
         <w:tc>
           <w:tcPr>
-            <w:tcW w:type="dxa" w:w="7272"/>
-            <w:vAlign w:val="center"/>
+            <w:tcW w:w="7272" w:type="dxa"/>
+            <w:shd w:val="clear" w:color="auto" w:fill="F3F6FA"/>
             <w:tcMar>
               <w:top w:w="80" w:type="dxa"/>
               <w:left w:w="85" w:type="dxa"/>
               <w:bottom w:w="80" w:type="dxa"/>
               <w:right w:w="85" w:type="dxa"/>
             </w:tcMar>
-            <w:shd w:val="clear" w:color="auto" w:fill="F3F6FA"/>
+            <w:vAlign w:val="center"/>
           </w:tcPr>
           <w:p>
             <w:pPr>
@@ -1861,18 +1910,19 @@
       <w:tr>
         <w:trPr>
           <w:cantSplit/>
+          <w:jc w:val="center"/>
         </w:trPr>
         <w:tc>
           <w:tcPr>
-            <w:tcW w:type="dxa" w:w="3240"/>
-            <w:vAlign w:val="center"/>
+            <w:tcW w:w="3240" w:type="dxa"/>
+            <w:shd w:val="clear" w:color="auto" w:fill="FFFFFF"/>
             <w:tcMar>
               <w:top w:w="80" w:type="dxa"/>
               <w:left w:w="85" w:type="dxa"/>
               <w:bottom w:w="80" w:type="dxa"/>
               <w:right w:w="85" w:type="dxa"/>
             </w:tcMar>
-            <w:shd w:val="clear" w:color="auto" w:fill="FFFFFF"/>
+            <w:vAlign w:val="center"/>
           </w:tcPr>
           <w:p>
             <w:pPr>
@@ -1889,15 +1939,15 @@
         </w:tc>
         <w:tc>
           <w:tcPr>
-            <w:tcW w:type="dxa" w:w="7272"/>
-            <w:vAlign w:val="center"/>
+            <w:tcW w:w="7272" w:type="dxa"/>
+            <w:shd w:val="clear" w:color="auto" w:fill="FFFFFF"/>
             <w:tcMar>
               <w:top w:w="80" w:type="dxa"/>
               <w:left w:w="85" w:type="dxa"/>
               <w:bottom w:w="80" w:type="dxa"/>
               <w:right w:w="85" w:type="dxa"/>
             </w:tcMar>
-            <w:shd w:val="clear" w:color="auto" w:fill="FFFFFF"/>
+            <w:vAlign w:val="center"/>
           </w:tcPr>
           <w:p>
             <w:pPr>
@@ -1907,7 +1957,13 @@
               <w:rPr>
                 <w:sz w:val="19"/>
               </w:rPr>
-              <w:t>Level Editor, primitivas y herramientas de blockout; Modeling Mode únicamente cuando resulte útil.</w:t>
+              <w:t>Level Editor, primitivas y herramientas de blockout;</w:t>
+            </w:r>
+            <w:r>
+              <w:rPr>
+                <w:sz w:val="19"/>
+              </w:rPr>
+              <w:t xml:space="preserve"> Modeling Mode únicamente cuando resulte útil.</w:t>
             </w:r>
           </w:p>
         </w:tc>
@@ -1915,18 +1971,19 @@
       <w:tr>
         <w:trPr>
           <w:cantSplit/>
+          <w:jc w:val="center"/>
         </w:trPr>
         <w:tc>
           <w:tcPr>
-            <w:tcW w:type="dxa" w:w="3240"/>
-            <w:vAlign w:val="center"/>
+            <w:tcW w:w="3240" w:type="dxa"/>
+            <w:shd w:val="clear" w:color="auto" w:fill="F3F6FA"/>
             <w:tcMar>
               <w:top w:w="80" w:type="dxa"/>
               <w:left w:w="85" w:type="dxa"/>
               <w:bottom w:w="80" w:type="dxa"/>
               <w:right w:w="85" w:type="dxa"/>
             </w:tcMar>
-            <w:shd w:val="clear" w:color="auto" w:fill="F3F6FA"/>
+            <w:vAlign w:val="center"/>
           </w:tcPr>
           <w:p>
             <w:pPr>
@@ -1943,15 +2000,15 @@
         </w:tc>
         <w:tc>
           <w:tcPr>
-            <w:tcW w:type="dxa" w:w="7272"/>
-            <w:vAlign w:val="center"/>
+            <w:tcW w:w="7272" w:type="dxa"/>
+            <w:shd w:val="clear" w:color="auto" w:fill="F3F6FA"/>
             <w:tcMar>
               <w:top w:w="80" w:type="dxa"/>
               <w:left w:w="85" w:type="dxa"/>
               <w:bottom w:w="80" w:type="dxa"/>
               <w:right w:w="85" w:type="dxa"/>
             </w:tcMar>
-            <w:shd w:val="clear" w:color="auto" w:fill="F3F6FA"/>
+            <w:vAlign w:val="center"/>
           </w:tcPr>
           <w:p>
             <w:pPr>
@@ -1972,7 +2029,10 @@
         <w:pStyle w:val="Ttulo1"/>
       </w:pPr>
       <w:r>
-        <w:t>5. Justificación de la elección</w:t>
+        <w:t xml:space="preserve">5. Justificación de la </w:t>
+      </w:r>
+      <w:r>
+        <w:t>elección</w:t>
       </w:r>
     </w:p>
     <w:p>
@@ -1984,12 +2044,15 @@
       </w:r>
     </w:p>
     <w:p>
-      <w:pPr/>
       <w:r>
-        <w:rPr>
-          <w:i w:val="0"/>
-        </w:rPr>
-        <w:t>Unreal Engine reúne dentro del mismo entorno herramientas directamente relacionadas con los principales requisitos del TP: desarrollo 3D, controlador de personaje, gravedad, colisiones, física, construcción de niveles y soporte de multiplayer. Esta integración permite reducir la cantidad de tecnologías diferentes que el equipo debe incorporar durante un proyecto de duración limitada.</w:t>
+        <w:t xml:space="preserve">Unreal Engine reúne dentro del mismo entorno herramientas directamente relacionadas con los principales requisitos del TP: desarrollo 3D, controlador de personaje, gravedad, colisiones, física, </w:t>
+      </w:r>
+      <w:r>
+        <w:lastRenderedPageBreak/>
+        <w:t>construcción de</w:t>
+      </w:r>
+      <w:r>
+        <w:t xml:space="preserve"> niveles y soporte de multiplayer. Esta integración permite reducir la cantidad de tecnologías diferentes que el equipo debe incorporar durante un proyecto de duración limitada.</w:t>
       </w:r>
     </w:p>
     <w:p>
@@ -2001,12 +2064,14 @@
       </w:r>
     </w:p>
     <w:p>
-      <w:pPr/>
       <w:r>
-        <w:rPr>
-          <w:i w:val="0"/>
-        </w:rPr>
-        <w:t>Blueprints fue uno de los factores principales de la elección. El equipo puede implementar lógica de gameplay mediante programación visual, utilizando eventos, variables, funciones y condiciones sin depender exclusivamente de C++. Esto no elimina la necesidad de comprender la lógica del sistema, pero permite concentrar el aprendizaje inicial en el funcionamiento del juego y del motor.</w:t>
+        <w:t>Blueprints fue uno de los factores pr</w:t>
+      </w:r>
+      <w:r>
+        <w:t>incipales de la elección. El equipo puede implementar lógica de gameplay mediante programación visual, utilizando eventos, variables, funciones y condiciones sin depender exclusivamente de C++. Esto no elimina la necesidad de comprender la lógica del siste</w:t>
+      </w:r>
+      <w:r>
+        <w:t>ma, pero permite concentrar el aprendizaje inicial en el funcionamiento del juego y del motor.</w:t>
       </w:r>
     </w:p>
     <w:p>
@@ -2018,12 +2083,14 @@
       </w:r>
     </w:p>
     <w:p>
-      <w:pPr/>
       <w:r>
-        <w:rPr>
-          <w:i w:val="0"/>
-        </w:rPr>
-        <w:t>Uno de los integrantes ya posee conocimientos de Unreal Engine y Blueprints. Además, el equipo cuenta con experiencia previa en Godot Engine. Para un equipo pequeño y un trabajo de cuatro sprints, disponer de conocimiento previo en más de una de las alternativas reduce parte del riesgo de aprendizaje. En el caso de Unreal, la experiencia existente resulta especialmente útil porque permite contar con una referencia interna para resolver dudas iniciales sobre el motor y Blueprints.</w:t>
+        <w:t>Uno de los integrantes ya posee conocimientos de Unreal Engine y Blueprints. Además, el equipo cuenta con experiencia p</w:t>
+      </w:r>
+      <w:r>
+        <w:t>revia en Godot Engine. Para un equipo pequeño y un trabajo de cuatro sprints, disponer de conocimiento previo en más de una de las alternativas reduce parte del riesgo de aprendizaje. En el caso de Unreal, la experiencia existente resulta especialmente úti</w:t>
+      </w:r>
+      <w:r>
+        <w:t>l porque permite contar con una referencia interna para resolver dudas iniciales sobre el motor y Blueprints.</w:t>
       </w:r>
     </w:p>
     <w:p>
@@ -2035,21 +2102,19 @@
       </w:r>
     </w:p>
     <w:p>
-      <w:pPr/>
       <w:r>
-        <w:rPr>
-          <w:i w:val="0"/>
-        </w:rPr>
-        <w:t>Durante el Sprint 1 se creó un proyecto utilizando la plantilla First Person de Unreal Engine. La prueba inicial fue satisfactoria como validación del entorno: el proyecto pudo ejecutarse y permitió observar una base funcional de primera persona que puede modificarse y extenderse para el trabajo práctico.</w:t>
+        <w:t>Durante el Sprint 1 se creó un proyecto utilizando la plantilla First Person de Unreal Engine. La prueb</w:t>
+      </w:r>
+      <w:r>
+        <w:t>a inicial fue satisfactoria como validación del entorno: el proyecto pudo ejecutarse y permitió observar una base funcional de primera persona que puede modificarse y extenderse para el trabajo práctico.</w:t>
       </w:r>
     </w:p>
     <w:p>
-      <w:pPr/>
       <w:r>
-        <w:rPr>
-          <w:i w:val="0"/>
-        </w:rPr>
-        <w:t>La plantilla no se considera una solución completa ni reemplaza la implementación de los requisitos. Su valor para la decisión consiste en reducir incertidumbre respecto de la puesta en marcha del motor y mostrar que existe una base sobre la cual comenzar a experimentar con las mecánicas solicitadas.</w:t>
+        <w:t>La plantilla no se considera una solución completa n</w:t>
+      </w:r>
+      <w:r>
+        <w:t>i reemplaza la implementación de los requisitos. Su valor para la decisión consiste en reducir incertidumbre respecto de la puesta en marcha del motor y mostrar que existe una base sobre la cual comenzar a experimentar con las mecánicas solicitadas.</w:t>
       </w:r>
     </w:p>
     <w:p>
@@ -2057,16 +2122,18 @@
         <w:pStyle w:val="Ttulo2"/>
       </w:pPr>
       <w:r>
-        <w:t>5.5 Hardware y costo monetario</w:t>
+        <w:t>5.5 Ha</w:t>
+      </w:r>
+      <w:r>
+        <w:t>rdware y costo monetario</w:t>
       </w:r>
     </w:p>
     <w:p>
-      <w:pPr/>
       <w:r>
-        <w:rPr>
-          <w:i w:val="0"/>
-        </w:rPr>
-        <w:t>Los tres integrantes cuentan con equipos capaces de trabajar con Unreal Engine, por lo que el rendimiento del editor no aparece actualmente como un impedimento para la elección. Para el contexto académico del proyecto tampoco se identificó un costo monetario relevante asociado al uso del motor.</w:t>
+        <w:t>Los tres integrantes cuentan con equipos capaces de trabajar con Unreal Engine, por lo que el rendimiento del editor no aparece actualmente como un impedimento para la elección. Para el contexto académico del proyecto tampoco se id</w:t>
+      </w:r>
+      <w:r>
+        <w:t>entificó un costo monetario relevante asociado al uso del motor.</w:t>
       </w:r>
     </w:p>
     <w:p>
@@ -2074,25 +2141,35 @@
         <w:pStyle w:val="Ttulo2"/>
       </w:pPr>
       <w:r>
-        <w:t>5.6 Multiplayer como factor de decisión y riesgo</w:t>
+        <w:t xml:space="preserve">5.6 Multiplayer </w:t>
+      </w:r>
+      <w:proofErr w:type="spellStart"/>
+      <w:r>
+        <w:t>como</w:t>
+      </w:r>
+      <w:proofErr w:type="spellEnd"/>
+      <w:r>
+        <w:t xml:space="preserve"> factor de decisión y riesgo</w:t>
       </w:r>
     </w:p>
     <w:p>
-      <w:pPr/>
       <w:r>
-        <w:rPr>
-          <w:i w:val="0"/>
-        </w:rPr>
-        <w:t>El multiplayer es obligatorio en el TP y ninguno de los integrantes posee experiencia previa implementándolo. Por este motivo se valoró que Unreal Engine disponga de un modelo de networking y replicación integrado y que Character Movement esté preparado para escenarios de movimiento en red.</w:t>
+        <w:t>El multiplayer es obligatorio en el TP y ninguno de los integrantes posee experiencia previa implementándolo. Por este motivo se valoró que Un</w:t>
+      </w:r>
+      <w:r>
+        <w:t>real Engine disponga de un modelo de networking y replicación integrado y que Character Movement esté preparado para escenarios de movimiento en red.</w:t>
       </w:r>
     </w:p>
     <w:p>
-      <w:pPr/>
       <w:r>
-        <w:rPr>
-          <w:i w:val="0"/>
-        </w:rPr>
-        <w:t>Al mismo tiempo, esta área continúa siendo la principal incertidumbre técnica. La decisión de utilizar Unreal no implica considerar resuelto el multiplayer: será necesario realizar una prueba temprana de conexión y sincronización antes de avanzar demasiado con funcionalidades que luego deban adaptarse a red.</w:t>
+        <w:t>Al mismo tiempo, esta área continúa siendo la principal incertidumbre técnica. La decisión de utilizar Unr</w:t>
+      </w:r>
+      <w:r>
+        <w:t xml:space="preserve">eal no implica considerar resuelto el multiplayer: será necesario realizar una prueba temprana </w:t>
+      </w:r>
+      <w:r>
+        <w:lastRenderedPageBreak/>
+        <w:t>de conexión y sincronización antes de avanzar demasiado con funcionalidades que luego deban adaptarse a red.</w:t>
       </w:r>
     </w:p>
     <w:p>
@@ -2112,21 +2189,19 @@
       </w:r>
     </w:p>
     <w:p>
-      <w:pPr/>
       <w:r>
-        <w:rPr>
-          <w:i w:val="0"/>
-        </w:rPr>
-        <w:t>Unity no se descarta por una limitación técnica. La investigación determinó que dispone de herramientas suficientes para construir el prototipo, incluyendo desarrollo 3D, física, controladores de personaje, Visual Scripting y soluciones oficiales de networking.</w:t>
+        <w:t>Unity no se descarta por una limitación técnica. La investigación determinó que dispone de herramientas suficientes para construir el prototipo, incluyendo desarrollo 3D, física, controladores de personaje, Visual Scripting y soluciones oficiales</w:t>
+      </w:r>
+      <w:r>
+        <w:t xml:space="preserve"> de networking.</w:t>
       </w:r>
     </w:p>
     <w:p>
-      <w:pPr/>
       <w:r>
-        <w:rPr>
-          <w:i w:val="0"/>
-        </w:rPr>
-        <w:t>Sin embargo, para las condiciones actuales del equipo se priorizó Unreal Engine por la combinación entre Blueprints, Character Movement, herramientas integradas de física y replicación, la experiencia previa de un integrante y la prueba inicial ya realizada. Unity queda definida como la primera alternativa de contingencia en caso de que aparezca un impedimento crítico con Unreal.</w:t>
+        <w:t>Sin embargo, para las condiciones actuales del equipo se priorizó Unreal Engine por la combinación entre Blueprints, Character Movement, herramientas integradas de física y replicación, la experiencia previa de un integrante y la prueba ini</w:t>
+      </w:r>
+      <w:r>
+        <w:t>cial ya realizada. Unity queda definida como la primera alternativa de contingencia en caso de que aparezca un impedimento crítico con Unreal.</w:t>
       </w:r>
     </w:p>
     <w:p>
@@ -2138,21 +2213,25 @@
       </w:r>
     </w:p>
     <w:p>
-      <w:pPr/>
       <w:r>
-        <w:rPr>
-          <w:i w:val="0"/>
-        </w:rPr>
-        <w:t>Godot también constituye una alternativa técnicamente válida para el alcance mínimo y el equipo cuenta con experiencia previa en este motor, lo que reduce parcialmente su costo de aprendizaje. No obstante, Godot 4 no incorpora un sistema oficial de programación visual integrado equivalente a Blueprints, por lo que el desarrollo del prototipo debería apoyarse en mayor medida en scripting escrito.</w:t>
+        <w:t xml:space="preserve">Godot también constituye una alternativa técnicamente válida para el alcance mínimo y el equipo </w:t>
+      </w:r>
+      <w:r>
+        <w:t xml:space="preserve">cuenta con experiencia previa en este motor, lo que reduce parcialmente su costo de aprendizaje. No obstante, Godot 4 no incorpora un sistema oficial de programación visual integrado equivalente a Blueprints, por lo que el desarrollo del prototipo debería </w:t>
+      </w:r>
+      <w:r>
+        <w:t>apoyarse en mayor medida en scripting escrito.</w:t>
       </w:r>
     </w:p>
     <w:p>
-      <w:pPr/>
       <w:r>
-        <w:rPr>
-          <w:i w:val="0"/>
-        </w:rPr>
-        <w:t>A pesar de la experiencia previa disponible, uno de los criterios del equipo es reducir el costo inicial de implementación y aprovechar programación visual para un prototipo de corta duración. Por este motivo, y porque Unity conserva un enfoque más cercano a las características buscadas en Unreal —desarrollo 3D, programación visual y herramientas oficiales de multiplayer—, el orden de preferencia definido por el equipo queda como Unreal Engine, Unity y luego Godot Engine. Godot permanece como una alternativa viable, pero secundaria.</w:t>
+        <w:t>A pesar de la experiencia previa disponible, uno de los criterios del equipo es reducir el costo inicial de implementación y aprovechar programación visual para un prototipo de corta duración. Por este motivo,</w:t>
+      </w:r>
+      <w:r>
+        <w:t xml:space="preserve"> y porque Unity conserva un enfoque más cercano a las características buscadas en Unreal —desarrollo 3D, programación visual y herramientas oficiales de multiplayer—, el orden de preferencia definido por el equipo queda como Unreal Engine, Unity y luego Go</w:t>
+      </w:r>
+      <w:r>
+        <w:t>dot Engine. Godot permanece como una alternativa viable, pero secundaria.</w:t>
       </w:r>
     </w:p>
     <w:p>
@@ -2164,20 +2243,15 @@
       </w:r>
     </w:p>
     <w:p>
-      <w:pPr/>
       <w:r>
-        <w:rPr>
-          <w:i w:val="0"/>
-        </w:rPr>
-        <w:t>La elección de Unreal Engine se considera adoptada para continuar el proyecto, pero no se interpreta como irreversible. Si durante las primeras iteraciones aparece evidencia de que la decisión compromete el cumplimiento del alcance obligatorio, el equipo deberá revisarla.</w:t>
+        <w:t>La elección de Unreal Engine se considera adoptada para continuar el proyecto, pero no se interpreta como irreversible. Si durante</w:t>
+      </w:r>
+      <w:r>
+        <w:t xml:space="preserve"> las primeras iteraciones aparece evidencia de que la decisión compromete el cumplimiento del alcance obligatorio, el equipo deberá revisarla.</w:t>
       </w:r>
     </w:p>
     <w:p>
-      <w:pPr/>
       <w:r>
-        <w:rPr>
-          <w:i w:val="0"/>
-        </w:rPr>
         <w:t>Las principales condiciones que podrían justificar una revisión son:</w:t>
       </w:r>
     </w:p>
@@ -2186,7 +2260,10 @@
         <w:spacing w:after="40"/>
       </w:pPr>
       <w:r>
-        <w:t>• Dificultades graves para implementar o comprender el sistema de multiplayer y replicación dentro del tiempo disponible.</w:t>
+        <w:t xml:space="preserve">• Dificultades graves para </w:t>
+      </w:r>
+      <w:r>
+        <w:t>implementar o comprender el sistema de multiplayer y replicación dentro del tiempo disponible.</w:t>
       </w:r>
     </w:p>
     <w:p>
@@ -2202,7 +2279,10 @@
         <w:spacing w:after="40"/>
       </w:pPr>
       <w:r>
-        <w:t>• Dificultades para mantener un proyecto compartido e integrar correctamente el trabajo de los integrantes.</w:t>
+        <w:t>• Dificultades para mantener un proyecto comparti</w:t>
+      </w:r>
+      <w:r>
+        <w:t>do e integrar correctamente el trabajo de los integrantes.</w:t>
       </w:r>
     </w:p>
     <w:p>
@@ -2210,63 +2290,271 @@
         <w:spacing w:after="40"/>
       </w:pPr>
       <w:r>
+        <w:lastRenderedPageBreak/>
         <w:t>• Necesidad de una cantidad de trabajo adicional no prevista que haga inviable cumplir el alcance mínimo dentro de los sprints establecidos.</w:t>
       </w:r>
     </w:p>
     <w:p>
-      <w:pPr/>
       <w:r>
-        <w:rPr>
-          <w:i w:val="0"/>
-        </w:rPr>
-        <w:t>Si fuera necesario reemplazar el motor, la primera alternativa a reconsiderar será Unity, debido a que conserva características cercanas a las buscadas por el equipo: desarrollo 3D, física, programación visual y soporte oficial de multiplayer. Godot permanecerá como segunda alternativa; la experiencia previa existente dentro del equipo reduciría el costo de una eventual migración hacia este motor, aunque requeriría una mayor dependencia de scripting escrito.</w:t>
+        <w:t xml:space="preserve">Si </w:t>
+      </w:r>
+      <w:proofErr w:type="spellStart"/>
+      <w:r>
+        <w:t>fuera</w:t>
+      </w:r>
+      <w:proofErr w:type="spellEnd"/>
+      <w:r>
+        <w:t xml:space="preserve"> </w:t>
+      </w:r>
+      <w:proofErr w:type="spellStart"/>
+      <w:r>
+        <w:t>necesario</w:t>
+      </w:r>
+      <w:proofErr w:type="spellEnd"/>
+      <w:r>
+        <w:t xml:space="preserve"> </w:t>
+      </w:r>
+      <w:proofErr w:type="spellStart"/>
+      <w:r>
+        <w:t>reemplazar</w:t>
+      </w:r>
+      <w:proofErr w:type="spellEnd"/>
+      <w:r>
+        <w:t xml:space="preserve"> el motor, la primera alter</w:t>
+      </w:r>
+      <w:r>
+        <w:t>nativa a reconsiderar será Unity, debido a que conserva características cercanas a las buscadas por el equipo: desarrollo 3D, física, programación visual y soporte oficial de multiplayer. Godot permanecerá como segunda alternativa; la experiencia previa ex</w:t>
+      </w:r>
+      <w:r>
+        <w:t xml:space="preserve">istente dentro del equipo reduciría el costo de una eventual migración hacia este motor, aunque requeriría una mayor </w:t>
+      </w:r>
+      <w:proofErr w:type="spellStart"/>
+      <w:r>
+        <w:t>dependencia</w:t>
+      </w:r>
+      <w:proofErr w:type="spellEnd"/>
+      <w:r>
+        <w:t xml:space="preserve"> de scripting </w:t>
+      </w:r>
+      <w:proofErr w:type="spellStart"/>
+      <w:r>
+        <w:t>escrito</w:t>
+      </w:r>
+      <w:proofErr w:type="spellEnd"/>
+      <w:r>
+        <w:t>.</w:t>
+      </w:r>
+    </w:p>
+    <w:p/>
+    <w:p>
+      <w:pPr>
+        <w:pStyle w:val="Ttulo2"/>
+      </w:pPr>
+      <w:r>
+        <w:t xml:space="preserve">7.1 </w:t>
+      </w:r>
+      <w:proofErr w:type="spellStart"/>
+      <w:r>
+        <w:t>Actualización</w:t>
+      </w:r>
+      <w:proofErr w:type="spellEnd"/>
+      <w:r>
+        <w:t xml:space="preserve"> de la decisión: adopción de </w:t>
+      </w:r>
+      <w:proofErr w:type="spellStart"/>
+      <w:r>
+        <w:t>Unreal</w:t>
+      </w:r>
+      <w:proofErr w:type="spellEnd"/>
+      <w:r>
+        <w:t xml:space="preserve"> </w:t>
+      </w:r>
+      <w:proofErr w:type="spellStart"/>
+      <w:r>
+        <w:t>Engine</w:t>
+      </w:r>
+      <w:proofErr w:type="spellEnd"/>
+      <w:r>
+        <w:t xml:space="preserve"> 4.27</w:t>
+      </w:r>
+    </w:p>
+    <w:p>
+      <w:r>
+        <w:t xml:space="preserve">Al </w:t>
+      </w:r>
+      <w:proofErr w:type="spellStart"/>
+      <w:r>
+        <w:t>inicio</w:t>
+      </w:r>
+      <w:proofErr w:type="spellEnd"/>
+      <w:r>
+        <w:t xml:space="preserve"> del Sprint 2 se probó una versión empaquetada del prototipo desarrollado con </w:t>
+      </w:r>
+      <w:proofErr w:type="spellStart"/>
+      <w:r>
+        <w:t>Unreal</w:t>
+      </w:r>
+      <w:proofErr w:type="spellEnd"/>
+      <w:r>
+        <w:t xml:space="preserve"> </w:t>
+      </w:r>
+      <w:proofErr w:type="spellStart"/>
+      <w:r>
+        <w:t>Engine</w:t>
+      </w:r>
+      <w:proofErr w:type="spellEnd"/>
+      <w:r>
+        <w:t xml:space="preserve"> 5 en una computadora de la Universidad. La ejecución alcanzó aproximadamente 5 FPS, incluso después de reducir la calidad gráfica, desactivar Lumen, sombras y otros efectos de alto costo. Este resultado mostró que la versión inicialmente utilizada no era viable para el hardware objetivo de presentación.</w:t>
+      </w:r>
+    </w:p>
+    <w:p>
+      <w:r>
+        <w:t xml:space="preserve">Como respuesta, el equipo realizó una prueba equivalente con </w:t>
+      </w:r>
+      <w:proofErr w:type="spellStart"/>
+      <w:r>
+        <w:t>Unreal</w:t>
+      </w:r>
+      <w:proofErr w:type="spellEnd"/>
+      <w:r>
+        <w:t xml:space="preserve"> </w:t>
+      </w:r>
+      <w:proofErr w:type="spellStart"/>
+      <w:r>
+        <w:t>Engine</w:t>
+      </w:r>
+      <w:proofErr w:type="spellEnd"/>
+      <w:r>
+        <w:t xml:space="preserve"> 4.27. Esta versión presentó un comportamiento considerablemente mejor y aceptable para continuar el desarrollo. Por lo tanto, el equipo mantiene </w:t>
+      </w:r>
+      <w:proofErr w:type="spellStart"/>
+      <w:r>
+        <w:t>Unreal</w:t>
+      </w:r>
+      <w:proofErr w:type="spellEnd"/>
+      <w:r>
+        <w:t xml:space="preserve"> </w:t>
+      </w:r>
+      <w:proofErr w:type="spellStart"/>
+      <w:r>
+        <w:t>Engine</w:t>
+      </w:r>
+      <w:proofErr w:type="spellEnd"/>
+      <w:r>
+        <w:t xml:space="preserve"> y </w:t>
+      </w:r>
+      <w:proofErr w:type="spellStart"/>
+      <w:r>
+        <w:t>Blueprints</w:t>
+      </w:r>
+      <w:proofErr w:type="spellEnd"/>
+      <w:r>
+        <w:t xml:space="preserve"> como solución tecnológica, pero adopta específicamente UE4.27 como versión de trabajo. El cambio conserva el enfoque, las herramientas y el conocimiento previo ya seleccionados, evitando el costo completo de migrar a otro motor.</w:t>
+      </w:r>
+    </w:p>
+    <w:p>
+      <w:r>
+        <w:t xml:space="preserve">La decisión permanecerá bajo validación durante los siguientes incrementos. Se repetirán pruebas de una </w:t>
+      </w:r>
+      <w:proofErr w:type="spellStart"/>
+      <w:r>
+        <w:t>build</w:t>
+      </w:r>
+      <w:proofErr w:type="spellEnd"/>
+      <w:r>
+        <w:t xml:space="preserve"> empaquetada al incorporar escenario, físicas y </w:t>
+      </w:r>
+      <w:proofErr w:type="spellStart"/>
+      <w:r>
+        <w:t>multiplayer</w:t>
+      </w:r>
+      <w:proofErr w:type="spellEnd"/>
+      <w:r>
+        <w:t>. Unity continúa como primera contingencia si UE4.27 deja de alcanzar un rendimiento jugable en el hardware de presentación.</w:t>
       </w:r>
     </w:p>
     <w:p>
       <w:pPr>
-        <w:pStyle w:val="Ttulo1"/>
+        <w:shd w:val="clear" w:color="auto" w:fill="FFFFFF"/>
+        <w:spacing w:after="0" w:line="240" w:lineRule="auto"/>
+        <w:rPr>
+          <w:rFonts w:eastAsia="Times New Roman" w:cs="Times New Roman"/>
+          <w:szCs w:val="23"/>
+          <w:lang w:val="es-ES" w:eastAsia="es-ES"/>
+        </w:rPr>
+      </w:pPr>
+    </w:p>
+    <w:p>
+      <w:pPr>
+        <w:shd w:val="clear" w:color="auto" w:fill="FFFFFF"/>
+        <w:spacing w:after="0" w:line="240" w:lineRule="auto"/>
+        <w:rPr>
+          <w:rFonts w:eastAsia="Times New Roman" w:cs="Times New Roman"/>
+          <w:szCs w:val="23"/>
+          <w:lang w:val="es-ES" w:eastAsia="es-ES"/>
+        </w:rPr>
       </w:pPr>
       <w:r>
+        <w:rPr>
+          <w:rFonts w:ascii="Calibri" w:eastAsia="Times New Roman" w:hAnsi="Calibri" w:cs="Calibri"/>
+          <w:b/>
+          <w:bCs/>
+          <w:color w:val="365F91"/>
+          <w:sz w:val="28"/>
+          <w:szCs w:val="28"/>
+          <w:lang w:val="es-ES" w:eastAsia="es-ES"/>
+        </w:rPr>
         <w:t>8. Resultado de la decisión</w:t>
       </w:r>
     </w:p>
     <w:tbl>
       <w:tblPr>
-        <w:tblW w:type="auto" w:w="0"/>
-        <w:jc w:val="center"/>
-        <w:tblLayout w:type="fixed"/>
-        <w:tblLook w:firstColumn="1" w:firstRow="1" w:lastColumn="0" w:lastRow="0" w:noHBand="0" w:noVBand="1" w:val="04A0"/>
+        <w:tblW w:w="0" w:type="dxa"/>
+        <w:tblBorders>
+          <w:top w:val="single" w:sz="2" w:space="0" w:color="auto"/>
+          <w:left w:val="single" w:sz="2" w:space="0" w:color="auto"/>
+          <w:bottom w:val="single" w:sz="2" w:space="0" w:color="auto"/>
+          <w:right w:val="single" w:sz="2" w:space="0" w:color="auto"/>
+        </w:tblBorders>
+        <w:shd w:val="clear" w:color="auto" w:fill="FFFFFF"/>
+        <w:tblLook w:val="04A0" w:firstRow="1" w:lastRow="0" w:firstColumn="1" w:lastColumn="0" w:noHBand="0" w:noVBand="1"/>
       </w:tblPr>
       <w:tblGrid>
-        <w:gridCol w:w="4703"/>
-        <w:gridCol w:w="4703"/>
+        <w:gridCol w:w="3021"/>
+        <w:gridCol w:w="6555"/>
       </w:tblGrid>
       <w:tr>
-        <w:trPr>
-          <w:cantSplit/>
-          <w:tblHeader w:val="true"/>
-        </w:trPr>
         <w:tc>
           <w:tcPr>
-            <w:tcW w:type="dxa" w:w="3240"/>
-            <w:vAlign w:val="center"/>
+            <w:tcW w:w="3240" w:type="dxa"/>
+            <w:shd w:val="clear" w:color="auto" w:fill="1F4E79"/>
             <w:tcMar>
               <w:top w:w="80" w:type="dxa"/>
               <w:left w:w="85" w:type="dxa"/>
               <w:bottom w:w="80" w:type="dxa"/>
               <w:right w:w="85" w:type="dxa"/>
             </w:tcMar>
-            <w:shd w:val="clear" w:color="auto" w:fill="1F4E79"/>
+            <w:vAlign w:val="center"/>
+            <w:hideMark/>
           </w:tcPr>
           <w:p>
             <w:pPr>
               <w:spacing w:after="0" w:line="240" w:lineRule="auto"/>
+              <w:rPr>
+                <w:rFonts w:eastAsia="Times New Roman" w:cs="Segoe UI"/>
+                <w:szCs w:val="23"/>
+                <w:lang w:val="es-ES" w:eastAsia="es-ES"/>
+              </w:rPr>
             </w:pPr>
             <w:r>
               <w:rPr>
+                <w:rFonts w:ascii="Cambria" w:eastAsia="Times New Roman" w:hAnsi="Cambria" w:cs="Segoe UI"/>
                 <w:b/>
+                <w:bCs/>
                 <w:color w:val="FFFFFF"/>
                 <w:sz w:val="19"/>
+                <w:szCs w:val="19"/>
+                <w:lang w:val="es-ES" w:eastAsia="es-ES"/>
               </w:rPr>
               <w:t>Campo</w:t>
             </w:r>
@@ -2274,25 +2562,35 @@
         </w:tc>
         <w:tc>
           <w:tcPr>
-            <w:tcW w:type="dxa" w:w="7272"/>
-            <w:vAlign w:val="center"/>
+            <w:tcW w:w="7272" w:type="dxa"/>
+            <w:shd w:val="clear" w:color="auto" w:fill="1F4E79"/>
             <w:tcMar>
               <w:top w:w="80" w:type="dxa"/>
               <w:left w:w="85" w:type="dxa"/>
               <w:bottom w:w="80" w:type="dxa"/>
               <w:right w:w="85" w:type="dxa"/>
             </w:tcMar>
-            <w:shd w:val="clear" w:color="auto" w:fill="1F4E79"/>
+            <w:vAlign w:val="center"/>
+            <w:hideMark/>
           </w:tcPr>
           <w:p>
             <w:pPr>
               <w:spacing w:after="0" w:line="240" w:lineRule="auto"/>
+              <w:rPr>
+                <w:rFonts w:eastAsia="Times New Roman" w:cs="Segoe UI"/>
+                <w:szCs w:val="23"/>
+                <w:lang w:val="es-ES" w:eastAsia="es-ES"/>
+              </w:rPr>
             </w:pPr>
             <w:r>
               <w:rPr>
+                <w:rFonts w:ascii="Cambria" w:eastAsia="Times New Roman" w:hAnsi="Cambria" w:cs="Segoe UI"/>
                 <w:b/>
+                <w:bCs/>
                 <w:color w:val="FFFFFF"/>
                 <w:sz w:val="19"/>
+                <w:szCs w:val="19"/>
+                <w:lang w:val="es-ES" w:eastAsia="es-ES"/>
               </w:rPr>
               <w:t>Registro</w:t>
             </w:r>
@@ -2300,29 +2598,36 @@
         </w:tc>
       </w:tr>
       <w:tr>
-        <w:trPr>
-          <w:cantSplit/>
-        </w:trPr>
         <w:tc>
           <w:tcPr>
-            <w:tcW w:type="dxa" w:w="3240"/>
-            <w:vAlign w:val="center"/>
+            <w:tcW w:w="3240" w:type="dxa"/>
+            <w:shd w:val="clear" w:color="auto" w:fill="F3F6FA"/>
             <w:tcMar>
               <w:top w:w="80" w:type="dxa"/>
               <w:left w:w="85" w:type="dxa"/>
               <w:bottom w:w="80" w:type="dxa"/>
               <w:right w:w="85" w:type="dxa"/>
             </w:tcMar>
-            <w:shd w:val="clear" w:color="auto" w:fill="F3F6FA"/>
+            <w:vAlign w:val="center"/>
+            <w:hideMark/>
           </w:tcPr>
           <w:p>
             <w:pPr>
               <w:spacing w:after="0" w:line="240" w:lineRule="auto"/>
+              <w:rPr>
+                <w:rFonts w:eastAsia="Times New Roman" w:cs="Segoe UI"/>
+                <w:szCs w:val="23"/>
+                <w:lang w:val="es-ES" w:eastAsia="es-ES"/>
+              </w:rPr>
             </w:pPr>
             <w:r>
               <w:rPr>
+                <w:rFonts w:ascii="Cambria" w:eastAsia="Times New Roman" w:hAnsi="Cambria" w:cs="Segoe UI"/>
                 <w:b/>
+                <w:bCs/>
                 <w:sz w:val="19"/>
+                <w:szCs w:val="19"/>
+                <w:lang w:val="es-ES" w:eastAsia="es-ES"/>
               </w:rPr>
               <w:t>Estado</w:t>
             </w:r>
@@ -2330,53 +2635,69 @@
         </w:tc>
         <w:tc>
           <w:tcPr>
-            <w:tcW w:type="dxa" w:w="7272"/>
-            <w:vAlign w:val="center"/>
+            <w:tcW w:w="7272" w:type="dxa"/>
+            <w:shd w:val="clear" w:color="auto" w:fill="F3F6FA"/>
             <w:tcMar>
               <w:top w:w="80" w:type="dxa"/>
               <w:left w:w="85" w:type="dxa"/>
               <w:bottom w:w="80" w:type="dxa"/>
               <w:right w:w="85" w:type="dxa"/>
             </w:tcMar>
-            <w:shd w:val="clear" w:color="auto" w:fill="F3F6FA"/>
+            <w:vAlign w:val="center"/>
+            <w:hideMark/>
           </w:tcPr>
           <w:p>
             <w:pPr>
               <w:spacing w:after="0" w:line="240" w:lineRule="auto"/>
+              <w:rPr>
+                <w:rFonts w:eastAsia="Times New Roman" w:cs="Segoe UI"/>
+                <w:szCs w:val="23"/>
+                <w:lang w:val="es-ES" w:eastAsia="es-ES"/>
+              </w:rPr>
             </w:pPr>
             <w:r>
               <w:rPr>
+                <w:rFonts w:ascii="Cambria" w:eastAsia="Times New Roman" w:hAnsi="Cambria" w:cs="Segoe UI"/>
                 <w:sz w:val="19"/>
+                <w:szCs w:val="19"/>
+                <w:lang w:val="es-ES" w:eastAsia="es-ES"/>
               </w:rPr>
-              <w:t>Decisión adoptada para el proyecto, sujeta a validación continua.</w:t>
+              <w:t>Decisión adoptada y actualizada al inicio del Sprint 2, sujeta a validación continúa.</w:t>
             </w:r>
           </w:p>
         </w:tc>
       </w:tr>
       <w:tr>
-        <w:trPr>
-          <w:cantSplit/>
-        </w:trPr>
         <w:tc>
           <w:tcPr>
-            <w:tcW w:type="dxa" w:w="3240"/>
-            <w:vAlign w:val="center"/>
+            <w:tcW w:w="3240" w:type="dxa"/>
+            <w:shd w:val="clear" w:color="auto" w:fill="FFFFFF"/>
             <w:tcMar>
               <w:top w:w="80" w:type="dxa"/>
               <w:left w:w="85" w:type="dxa"/>
               <w:bottom w:w="80" w:type="dxa"/>
               <w:right w:w="85" w:type="dxa"/>
             </w:tcMar>
-            <w:shd w:val="clear" w:color="auto" w:fill="FFFFFF"/>
+            <w:vAlign w:val="center"/>
+            <w:hideMark/>
           </w:tcPr>
           <w:p>
             <w:pPr>
               <w:spacing w:after="0" w:line="240" w:lineRule="auto"/>
+              <w:rPr>
+                <w:rFonts w:eastAsia="Times New Roman" w:cs="Segoe UI"/>
+                <w:szCs w:val="23"/>
+                <w:lang w:val="es-ES" w:eastAsia="es-ES"/>
+              </w:rPr>
             </w:pPr>
             <w:r>
               <w:rPr>
+                <w:rFonts w:ascii="Cambria" w:eastAsia="Times New Roman" w:hAnsi="Cambria" w:cs="Segoe UI"/>
                 <w:b/>
+                <w:bCs/>
                 <w:sz w:val="19"/>
+                <w:szCs w:val="19"/>
+                <w:lang w:val="es-ES" w:eastAsia="es-ES"/>
               </w:rPr>
               <w:t>Motor seleccionado</w:t>
             </w:r>
@@ -2384,53 +2705,100 @@
         </w:tc>
         <w:tc>
           <w:tcPr>
-            <w:tcW w:type="dxa" w:w="7272"/>
-            <w:vAlign w:val="center"/>
+            <w:tcW w:w="7272" w:type="dxa"/>
+            <w:shd w:val="clear" w:color="auto" w:fill="FFFFFF"/>
             <w:tcMar>
               <w:top w:w="80" w:type="dxa"/>
               <w:left w:w="85" w:type="dxa"/>
               <w:bottom w:w="80" w:type="dxa"/>
               <w:right w:w="85" w:type="dxa"/>
             </w:tcMar>
-            <w:shd w:val="clear" w:color="auto" w:fill="FFFFFF"/>
+            <w:vAlign w:val="center"/>
+            <w:hideMark/>
           </w:tcPr>
           <w:p>
             <w:pPr>
               <w:spacing w:after="0" w:line="240" w:lineRule="auto"/>
+              <w:rPr>
+                <w:rFonts w:eastAsia="Times New Roman" w:cs="Segoe UI"/>
+                <w:szCs w:val="23"/>
+                <w:lang w:val="es-ES" w:eastAsia="es-ES"/>
+              </w:rPr>
             </w:pPr>
+            <w:proofErr w:type="spellStart"/>
             <w:r>
               <w:rPr>
+                <w:rFonts w:ascii="Cambria" w:eastAsia="Times New Roman" w:hAnsi="Cambria" w:cs="Segoe UI"/>
                 <w:sz w:val="19"/>
+                <w:szCs w:val="19"/>
+                <w:lang w:val="es-ES" w:eastAsia="es-ES"/>
               </w:rPr>
-              <w:t>Unreal Engine.</w:t>
+              <w:t>Unreal</w:t>
+            </w:r>
+            <w:proofErr w:type="spellEnd"/>
+            <w:r>
+              <w:rPr>
+                <w:rFonts w:ascii="Cambria" w:eastAsia="Times New Roman" w:hAnsi="Cambria" w:cs="Segoe UI"/>
+                <w:sz w:val="19"/>
+                <w:szCs w:val="19"/>
+                <w:lang w:val="es-ES" w:eastAsia="es-ES"/>
+              </w:rPr>
+              <w:t xml:space="preserve"> </w:t>
+            </w:r>
+            <w:proofErr w:type="spellStart"/>
+            <w:r>
+              <w:rPr>
+                <w:rFonts w:ascii="Cambria" w:eastAsia="Times New Roman" w:hAnsi="Cambria" w:cs="Segoe UI"/>
+                <w:sz w:val="19"/>
+                <w:szCs w:val="19"/>
+                <w:lang w:val="es-ES" w:eastAsia="es-ES"/>
+              </w:rPr>
+              <w:t>Engine</w:t>
+            </w:r>
+            <w:proofErr w:type="spellEnd"/>
+            <w:r>
+              <w:rPr>
+                <w:rFonts w:ascii="Cambria" w:eastAsia="Times New Roman" w:hAnsi="Cambria" w:cs="Segoe UI"/>
+                <w:sz w:val="19"/>
+                <w:szCs w:val="19"/>
+                <w:lang w:val="es-ES" w:eastAsia="es-ES"/>
+              </w:rPr>
+              <w:t xml:space="preserve"> 4.27.</w:t>
             </w:r>
           </w:p>
         </w:tc>
       </w:tr>
       <w:tr>
-        <w:trPr>
-          <w:cantSplit/>
-        </w:trPr>
         <w:tc>
           <w:tcPr>
-            <w:tcW w:type="dxa" w:w="3240"/>
-            <w:vAlign w:val="center"/>
+            <w:tcW w:w="3240" w:type="dxa"/>
+            <w:shd w:val="clear" w:color="auto" w:fill="F3F6FA"/>
             <w:tcMar>
               <w:top w:w="80" w:type="dxa"/>
               <w:left w:w="85" w:type="dxa"/>
               <w:bottom w:w="80" w:type="dxa"/>
               <w:right w:w="85" w:type="dxa"/>
             </w:tcMar>
-            <w:shd w:val="clear" w:color="auto" w:fill="F3F6FA"/>
+            <w:vAlign w:val="center"/>
+            <w:hideMark/>
           </w:tcPr>
           <w:p>
             <w:pPr>
               <w:spacing w:after="0" w:line="240" w:lineRule="auto"/>
+              <w:rPr>
+                <w:rFonts w:eastAsia="Times New Roman" w:cs="Segoe UI"/>
+                <w:szCs w:val="23"/>
+                <w:lang w:val="es-ES" w:eastAsia="es-ES"/>
+              </w:rPr>
             </w:pPr>
             <w:r>
               <w:rPr>
+                <w:rFonts w:ascii="Cambria" w:eastAsia="Times New Roman" w:hAnsi="Cambria" w:cs="Segoe UI"/>
                 <w:b/>
+                <w:bCs/>
                 <w:sz w:val="19"/>
+                <w:szCs w:val="19"/>
+                <w:lang w:val="es-ES" w:eastAsia="es-ES"/>
               </w:rPr>
               <w:t>Estrategia principal</w:t>
             </w:r>
@@ -2438,53 +2806,89 @@
         </w:tc>
         <w:tc>
           <w:tcPr>
-            <w:tcW w:type="dxa" w:w="7272"/>
-            <w:vAlign w:val="center"/>
+            <w:tcW w:w="7272" w:type="dxa"/>
+            <w:shd w:val="clear" w:color="auto" w:fill="F3F6FA"/>
             <w:tcMar>
               <w:top w:w="80" w:type="dxa"/>
               <w:left w:w="85" w:type="dxa"/>
               <w:bottom w:w="80" w:type="dxa"/>
               <w:right w:w="85" w:type="dxa"/>
             </w:tcMar>
-            <w:shd w:val="clear" w:color="auto" w:fill="F3F6FA"/>
+            <w:vAlign w:val="center"/>
+            <w:hideMark/>
           </w:tcPr>
           <w:p>
             <w:pPr>
               <w:spacing w:after="0" w:line="240" w:lineRule="auto"/>
+              <w:rPr>
+                <w:rFonts w:eastAsia="Times New Roman" w:cs="Segoe UI"/>
+                <w:szCs w:val="23"/>
+                <w:lang w:val="es-ES" w:eastAsia="es-ES"/>
+              </w:rPr>
             </w:pPr>
             <w:r>
               <w:rPr>
+                <w:rFonts w:ascii="Cambria" w:eastAsia="Times New Roman" w:hAnsi="Cambria" w:cs="Segoe UI"/>
                 <w:sz w:val="19"/>
+                <w:szCs w:val="19"/>
+                <w:lang w:val="es-ES" w:eastAsia="es-ES"/>
               </w:rPr>
-              <w:t>Desarrollo apoyado principalmente en Blueprints y herramientas integradas del motor.</w:t>
+              <w:t xml:space="preserve">Desarrollo apoyado principalmente en </w:t>
+            </w:r>
+            <w:proofErr w:type="spellStart"/>
+            <w:r>
+              <w:rPr>
+                <w:rFonts w:ascii="Cambria" w:eastAsia="Times New Roman" w:hAnsi="Cambria" w:cs="Segoe UI"/>
+                <w:sz w:val="19"/>
+                <w:szCs w:val="19"/>
+                <w:lang w:val="es-ES" w:eastAsia="es-ES"/>
+              </w:rPr>
+              <w:t>Blueprints</w:t>
+            </w:r>
+            <w:proofErr w:type="spellEnd"/>
+            <w:r>
+              <w:rPr>
+                <w:rFonts w:ascii="Cambria" w:eastAsia="Times New Roman" w:hAnsi="Cambria" w:cs="Segoe UI"/>
+                <w:sz w:val="19"/>
+                <w:szCs w:val="19"/>
+                <w:lang w:val="es-ES" w:eastAsia="es-ES"/>
+              </w:rPr>
+              <w:t xml:space="preserve"> y herramientas integradas del motor.</w:t>
             </w:r>
           </w:p>
         </w:tc>
       </w:tr>
       <w:tr>
-        <w:trPr>
-          <w:cantSplit/>
-        </w:trPr>
         <w:tc>
           <w:tcPr>
-            <w:tcW w:type="dxa" w:w="3240"/>
-            <w:vAlign w:val="center"/>
+            <w:tcW w:w="3240" w:type="dxa"/>
+            <w:shd w:val="clear" w:color="auto" w:fill="FFFFFF"/>
             <w:tcMar>
               <w:top w:w="80" w:type="dxa"/>
               <w:left w:w="85" w:type="dxa"/>
               <w:bottom w:w="80" w:type="dxa"/>
               <w:right w:w="85" w:type="dxa"/>
             </w:tcMar>
-            <w:shd w:val="clear" w:color="auto" w:fill="FFFFFF"/>
+            <w:vAlign w:val="center"/>
+            <w:hideMark/>
           </w:tcPr>
           <w:p>
             <w:pPr>
               <w:spacing w:after="0" w:line="240" w:lineRule="auto"/>
+              <w:rPr>
+                <w:rFonts w:eastAsia="Times New Roman" w:cs="Segoe UI"/>
+                <w:szCs w:val="23"/>
+                <w:lang w:val="es-ES" w:eastAsia="es-ES"/>
+              </w:rPr>
             </w:pPr>
             <w:r>
               <w:rPr>
+                <w:rFonts w:ascii="Cambria" w:eastAsia="Times New Roman" w:hAnsi="Cambria" w:cs="Segoe UI"/>
                 <w:b/>
+                <w:bCs/>
                 <w:sz w:val="19"/>
+                <w:szCs w:val="19"/>
+                <w:lang w:val="es-ES" w:eastAsia="es-ES"/>
               </w:rPr>
               <w:t>Principal fortaleza</w:t>
             </w:r>
@@ -2492,53 +2896,89 @@
         </w:tc>
         <w:tc>
           <w:tcPr>
-            <w:tcW w:type="dxa" w:w="7272"/>
-            <w:vAlign w:val="center"/>
+            <w:tcW w:w="7272" w:type="dxa"/>
+            <w:shd w:val="clear" w:color="auto" w:fill="FFFFFF"/>
             <w:tcMar>
               <w:top w:w="80" w:type="dxa"/>
               <w:left w:w="85" w:type="dxa"/>
               <w:bottom w:w="80" w:type="dxa"/>
               <w:right w:w="85" w:type="dxa"/>
             </w:tcMar>
-            <w:shd w:val="clear" w:color="auto" w:fill="FFFFFF"/>
+            <w:vAlign w:val="center"/>
+            <w:hideMark/>
           </w:tcPr>
           <w:p>
             <w:pPr>
               <w:spacing w:after="0" w:line="240" w:lineRule="auto"/>
+              <w:rPr>
+                <w:rFonts w:eastAsia="Times New Roman" w:cs="Segoe UI"/>
+                <w:szCs w:val="23"/>
+                <w:lang w:val="es-ES" w:eastAsia="es-ES"/>
+              </w:rPr>
             </w:pPr>
             <w:r>
               <w:rPr>
+                <w:rFonts w:ascii="Cambria" w:eastAsia="Times New Roman" w:hAnsi="Cambria" w:cs="Segoe UI"/>
                 <w:sz w:val="19"/>
+                <w:szCs w:val="19"/>
+                <w:lang w:val="es-ES" w:eastAsia="es-ES"/>
               </w:rPr>
-              <w:t>Integración de herramientas necesarias para 3D/FPS, física y multiplayer, sumada a experiencia previa dentro del equipo.</w:t>
+              <w:t xml:space="preserve">Integración de herramientas necesarias para 3D/FPS, física y </w:t>
+            </w:r>
+            <w:proofErr w:type="spellStart"/>
+            <w:r>
+              <w:rPr>
+                <w:rFonts w:ascii="Cambria" w:eastAsia="Times New Roman" w:hAnsi="Cambria" w:cs="Segoe UI"/>
+                <w:sz w:val="19"/>
+                <w:szCs w:val="19"/>
+                <w:lang w:val="es-ES" w:eastAsia="es-ES"/>
+              </w:rPr>
+              <w:t>multiplayer</w:t>
+            </w:r>
+            <w:proofErr w:type="spellEnd"/>
+            <w:r>
+              <w:rPr>
+                <w:rFonts w:ascii="Cambria" w:eastAsia="Times New Roman" w:hAnsi="Cambria" w:cs="Segoe UI"/>
+                <w:sz w:val="19"/>
+                <w:szCs w:val="19"/>
+                <w:lang w:val="es-ES" w:eastAsia="es-ES"/>
+              </w:rPr>
+              <w:t>, sumada a experiencia previa dentro del equipo.</w:t>
             </w:r>
           </w:p>
         </w:tc>
       </w:tr>
       <w:tr>
-        <w:trPr>
-          <w:cantSplit/>
-        </w:trPr>
         <w:tc>
           <w:tcPr>
-            <w:tcW w:type="dxa" w:w="3240"/>
-            <w:vAlign w:val="center"/>
+            <w:tcW w:w="3240" w:type="dxa"/>
+            <w:shd w:val="clear" w:color="auto" w:fill="F3F6FA"/>
             <w:tcMar>
               <w:top w:w="80" w:type="dxa"/>
               <w:left w:w="85" w:type="dxa"/>
               <w:bottom w:w="80" w:type="dxa"/>
               <w:right w:w="85" w:type="dxa"/>
             </w:tcMar>
-            <w:shd w:val="clear" w:color="auto" w:fill="F3F6FA"/>
+            <w:vAlign w:val="center"/>
+            <w:hideMark/>
           </w:tcPr>
           <w:p>
             <w:pPr>
               <w:spacing w:after="0" w:line="240" w:lineRule="auto"/>
+              <w:rPr>
+                <w:rFonts w:eastAsia="Times New Roman" w:cs="Segoe UI"/>
+                <w:szCs w:val="23"/>
+                <w:lang w:val="es-ES" w:eastAsia="es-ES"/>
+              </w:rPr>
             </w:pPr>
             <w:r>
               <w:rPr>
+                <w:rFonts w:ascii="Cambria" w:eastAsia="Times New Roman" w:hAnsi="Cambria" w:cs="Segoe UI"/>
                 <w:b/>
+                <w:bCs/>
                 <w:sz w:val="19"/>
+                <w:szCs w:val="19"/>
+                <w:lang w:val="es-ES" w:eastAsia="es-ES"/>
               </w:rPr>
               <w:t>Principal incertidumbre pendiente</w:t>
             </w:r>
@@ -2546,53 +2986,100 @@
         </w:tc>
         <w:tc>
           <w:tcPr>
-            <w:tcW w:type="dxa" w:w="7272"/>
-            <w:vAlign w:val="center"/>
+            <w:tcW w:w="7272" w:type="dxa"/>
+            <w:shd w:val="clear" w:color="auto" w:fill="F3F6FA"/>
             <w:tcMar>
               <w:top w:w="80" w:type="dxa"/>
               <w:left w:w="85" w:type="dxa"/>
               <w:bottom w:w="80" w:type="dxa"/>
               <w:right w:w="85" w:type="dxa"/>
             </w:tcMar>
-            <w:shd w:val="clear" w:color="auto" w:fill="F3F6FA"/>
+            <w:vAlign w:val="center"/>
+            <w:hideMark/>
           </w:tcPr>
           <w:p>
             <w:pPr>
               <w:spacing w:after="0" w:line="240" w:lineRule="auto"/>
+              <w:rPr>
+                <w:rFonts w:eastAsia="Times New Roman" w:cs="Segoe UI"/>
+                <w:szCs w:val="23"/>
+                <w:lang w:val="es-ES" w:eastAsia="es-ES"/>
+              </w:rPr>
             </w:pPr>
+            <w:proofErr w:type="spellStart"/>
             <w:r>
               <w:rPr>
+                <w:rFonts w:ascii="Cambria" w:eastAsia="Times New Roman" w:hAnsi="Cambria" w:cs="Segoe UI"/>
                 <w:sz w:val="19"/>
+                <w:szCs w:val="19"/>
+                <w:lang w:val="es-ES" w:eastAsia="es-ES"/>
               </w:rPr>
-              <w:t>Multiplayer, networking y replicación.</w:t>
+              <w:t>Multiplayer</w:t>
+            </w:r>
+            <w:proofErr w:type="spellEnd"/>
+            <w:r>
+              <w:rPr>
+                <w:rFonts w:ascii="Cambria" w:eastAsia="Times New Roman" w:hAnsi="Cambria" w:cs="Segoe UI"/>
+                <w:sz w:val="19"/>
+                <w:szCs w:val="19"/>
+                <w:lang w:val="es-ES" w:eastAsia="es-ES"/>
+              </w:rPr>
+              <w:t xml:space="preserve">, </w:t>
+            </w:r>
+            <w:proofErr w:type="spellStart"/>
+            <w:r>
+              <w:rPr>
+                <w:rFonts w:ascii="Cambria" w:eastAsia="Times New Roman" w:hAnsi="Cambria" w:cs="Segoe UI"/>
+                <w:sz w:val="19"/>
+                <w:szCs w:val="19"/>
+                <w:lang w:val="es-ES" w:eastAsia="es-ES"/>
+              </w:rPr>
+              <w:t>networking</w:t>
+            </w:r>
+            <w:proofErr w:type="spellEnd"/>
+            <w:r>
+              <w:rPr>
+                <w:rFonts w:ascii="Cambria" w:eastAsia="Times New Roman" w:hAnsi="Cambria" w:cs="Segoe UI"/>
+                <w:sz w:val="19"/>
+                <w:szCs w:val="19"/>
+                <w:lang w:val="es-ES" w:eastAsia="es-ES"/>
+              </w:rPr>
+              <w:t xml:space="preserve"> y replicación; seguimiento del rendimiento en el hardware objetivo de presentación.</w:t>
             </w:r>
           </w:p>
         </w:tc>
       </w:tr>
       <w:tr>
-        <w:trPr>
-          <w:cantSplit/>
-        </w:trPr>
         <w:tc>
           <w:tcPr>
-            <w:tcW w:type="dxa" w:w="3240"/>
-            <w:vAlign w:val="center"/>
+            <w:tcW w:w="3240" w:type="dxa"/>
+            <w:shd w:val="clear" w:color="auto" w:fill="FFFFFF"/>
             <w:tcMar>
               <w:top w:w="80" w:type="dxa"/>
               <w:left w:w="85" w:type="dxa"/>
               <w:bottom w:w="80" w:type="dxa"/>
               <w:right w:w="85" w:type="dxa"/>
             </w:tcMar>
-            <w:shd w:val="clear" w:color="auto" w:fill="FFFFFF"/>
+            <w:vAlign w:val="center"/>
+            <w:hideMark/>
           </w:tcPr>
           <w:p>
             <w:pPr>
               <w:spacing w:after="0" w:line="240" w:lineRule="auto"/>
+              <w:rPr>
+                <w:rFonts w:eastAsia="Times New Roman" w:cs="Segoe UI"/>
+                <w:szCs w:val="23"/>
+                <w:lang w:val="es-ES" w:eastAsia="es-ES"/>
+              </w:rPr>
             </w:pPr>
             <w:r>
               <w:rPr>
+                <w:rFonts w:ascii="Cambria" w:eastAsia="Times New Roman" w:hAnsi="Cambria" w:cs="Segoe UI"/>
                 <w:b/>
+                <w:bCs/>
                 <w:sz w:val="19"/>
+                <w:szCs w:val="19"/>
+                <w:lang w:val="es-ES" w:eastAsia="es-ES"/>
               </w:rPr>
               <w:t>Alternativa de contingencia</w:t>
             </w:r>
@@ -2600,23 +3087,32 @@
         </w:tc>
         <w:tc>
           <w:tcPr>
-            <w:tcW w:type="dxa" w:w="7272"/>
-            <w:vAlign w:val="center"/>
+            <w:tcW w:w="7272" w:type="dxa"/>
+            <w:shd w:val="clear" w:color="auto" w:fill="FFFFFF"/>
             <w:tcMar>
               <w:top w:w="80" w:type="dxa"/>
               <w:left w:w="85" w:type="dxa"/>
               <w:bottom w:w="80" w:type="dxa"/>
               <w:right w:w="85" w:type="dxa"/>
             </w:tcMar>
-            <w:shd w:val="clear" w:color="auto" w:fill="FFFFFF"/>
+            <w:vAlign w:val="center"/>
+            <w:hideMark/>
           </w:tcPr>
           <w:p>
             <w:pPr>
               <w:spacing w:after="0" w:line="240" w:lineRule="auto"/>
+              <w:rPr>
+                <w:rFonts w:eastAsia="Times New Roman" w:cs="Segoe UI"/>
+                <w:szCs w:val="23"/>
+                <w:lang w:val="es-ES" w:eastAsia="es-ES"/>
+              </w:rPr>
             </w:pPr>
             <w:r>
               <w:rPr>
+                <w:rFonts w:ascii="Cambria" w:eastAsia="Times New Roman" w:hAnsi="Cambria" w:cs="Segoe UI"/>
                 <w:sz w:val="19"/>
+                <w:szCs w:val="19"/>
+                <w:lang w:val="es-ES" w:eastAsia="es-ES"/>
               </w:rPr>
               <w:t>Unity.</w:t>
             </w:r>
@@ -2624,29 +3120,36 @@
         </w:tc>
       </w:tr>
       <w:tr>
-        <w:trPr>
-          <w:cantSplit/>
-        </w:trPr>
         <w:tc>
           <w:tcPr>
-            <w:tcW w:type="dxa" w:w="3240"/>
-            <w:vAlign w:val="center"/>
+            <w:tcW w:w="3240" w:type="dxa"/>
+            <w:shd w:val="clear" w:color="auto" w:fill="F3F6FA"/>
             <w:tcMar>
               <w:top w:w="80" w:type="dxa"/>
               <w:left w:w="85" w:type="dxa"/>
               <w:bottom w:w="80" w:type="dxa"/>
               <w:right w:w="85" w:type="dxa"/>
             </w:tcMar>
-            <w:shd w:val="clear" w:color="auto" w:fill="F3F6FA"/>
+            <w:vAlign w:val="center"/>
+            <w:hideMark/>
           </w:tcPr>
           <w:p>
             <w:pPr>
               <w:spacing w:after="0" w:line="240" w:lineRule="auto"/>
+              <w:rPr>
+                <w:rFonts w:eastAsia="Times New Roman" w:cs="Segoe UI"/>
+                <w:szCs w:val="23"/>
+                <w:lang w:val="es-ES" w:eastAsia="es-ES"/>
+              </w:rPr>
             </w:pPr>
             <w:r>
               <w:rPr>
+                <w:rFonts w:ascii="Cambria" w:eastAsia="Times New Roman" w:hAnsi="Cambria" w:cs="Segoe UI"/>
                 <w:b/>
+                <w:bCs/>
                 <w:sz w:val="19"/>
+                <w:szCs w:val="19"/>
+                <w:lang w:val="es-ES" w:eastAsia="es-ES"/>
               </w:rPr>
               <w:t>Segunda alternativa</w:t>
             </w:r>
@@ -2654,37 +3157,111 @@
         </w:tc>
         <w:tc>
           <w:tcPr>
-            <w:tcW w:type="dxa" w:w="7272"/>
-            <w:vAlign w:val="center"/>
+            <w:tcW w:w="7272" w:type="dxa"/>
+            <w:shd w:val="clear" w:color="auto" w:fill="F3F6FA"/>
             <w:tcMar>
               <w:top w:w="80" w:type="dxa"/>
               <w:left w:w="85" w:type="dxa"/>
               <w:bottom w:w="80" w:type="dxa"/>
               <w:right w:w="85" w:type="dxa"/>
             </w:tcMar>
-            <w:shd w:val="clear" w:color="auto" w:fill="F3F6FA"/>
+            <w:vAlign w:val="center"/>
+            <w:hideMark/>
           </w:tcPr>
           <w:p>
             <w:pPr>
               <w:spacing w:after="0" w:line="240" w:lineRule="auto"/>
+              <w:rPr>
+                <w:rFonts w:eastAsia="Times New Roman" w:cs="Segoe UI"/>
+                <w:szCs w:val="23"/>
+                <w:lang w:val="es-ES" w:eastAsia="es-ES"/>
+              </w:rPr>
             </w:pPr>
             <w:r>
               <w:rPr>
+                <w:rFonts w:ascii="Cambria" w:eastAsia="Times New Roman" w:hAnsi="Cambria" w:cs="Segoe UI"/>
                 <w:sz w:val="19"/>
+                <w:szCs w:val="19"/>
+                <w:lang w:val="es-ES" w:eastAsia="es-ES"/>
               </w:rPr>
-              <w:t>Godot Engine.</w:t>
+              <w:t xml:space="preserve">Godot </w:t>
+            </w:r>
+            <w:proofErr w:type="spellStart"/>
+            <w:r>
+              <w:rPr>
+                <w:rFonts w:ascii="Cambria" w:eastAsia="Times New Roman" w:hAnsi="Cambria" w:cs="Segoe UI"/>
+                <w:sz w:val="19"/>
+                <w:szCs w:val="19"/>
+                <w:lang w:val="es-ES" w:eastAsia="es-ES"/>
+              </w:rPr>
+              <w:t>Engine</w:t>
+            </w:r>
+            <w:proofErr w:type="spellEnd"/>
+            <w:r>
+              <w:rPr>
+                <w:rFonts w:ascii="Cambria" w:eastAsia="Times New Roman" w:hAnsi="Cambria" w:cs="Segoe UI"/>
+                <w:sz w:val="19"/>
+                <w:szCs w:val="19"/>
+                <w:lang w:val="es-ES" w:eastAsia="es-ES"/>
+              </w:rPr>
+              <w:t>.</w:t>
             </w:r>
           </w:p>
         </w:tc>
       </w:tr>
     </w:tbl>
     <w:p>
-      <w:pPr/>
       <w:r>
-        <w:rPr>
-          <w:i w:val="0"/>
-        </w:rPr>
-        <w:t>Con la información disponible al cierre de esta decisión, Unreal Engine es la opción que mejor equilibra capacidad técnica, reducción de incertidumbre, conocimiento previo del equipo y velocidad de prototipado. La decisión deberá seguir siendo contrastada con evidencia durante la implementación, especialmente al comenzar las pruebas de multiplayer.</w:t>
+        <w:lastRenderedPageBreak/>
+        <w:t xml:space="preserve">Con la </w:t>
+      </w:r>
+      <w:proofErr w:type="spellStart"/>
+      <w:r>
+        <w:t>evidencia</w:t>
+      </w:r>
+      <w:proofErr w:type="spellEnd"/>
+      <w:r>
+        <w:t xml:space="preserve"> disponible al inicio del Sprint 2, </w:t>
+      </w:r>
+      <w:proofErr w:type="spellStart"/>
+      <w:r>
+        <w:t>Unreal</w:t>
+      </w:r>
+      <w:proofErr w:type="spellEnd"/>
+      <w:r>
+        <w:t xml:space="preserve"> </w:t>
+      </w:r>
+      <w:proofErr w:type="spellStart"/>
+      <w:r>
+        <w:t>Engine</w:t>
+      </w:r>
+      <w:proofErr w:type="spellEnd"/>
+      <w:r>
+        <w:t xml:space="preserve"> 4.27 es la opción que mejor equilibra capacidad técnica, compatibilidad con el hardware objetivo, conocimiento previo del equipo y velocidad de prototipado. La adopción de una versión anterior del mismo motor responde a una prueba concreta de rendimiento y permite mantener </w:t>
+      </w:r>
+      <w:proofErr w:type="spellStart"/>
+      <w:r>
+        <w:t>Blueprints</w:t>
+      </w:r>
+      <w:proofErr w:type="spellEnd"/>
+      <w:r>
+        <w:t xml:space="preserve"> y las herramientas previstas. La decisión deberá seguir </w:t>
+      </w:r>
+      <w:proofErr w:type="spellStart"/>
+      <w:r>
+        <w:t>contrastandose</w:t>
+      </w:r>
+      <w:proofErr w:type="spellEnd"/>
+      <w:r>
+        <w:t xml:space="preserve"> con evidencia, especialmente al crecer el escenario y comenzar las pruebas de </w:t>
+      </w:r>
+      <w:proofErr w:type="spellStart"/>
+      <w:r>
+        <w:t>multiplayer</w:t>
+      </w:r>
+      <w:proofErr w:type="spellEnd"/>
+      <w:r>
+        <w:t>.</w:t>
       </w:r>
     </w:p>
     <w:p>
@@ -2696,26 +3273,21 @@
       </w:r>
     </w:p>
     <w:p>
-      <w:pPr/>
       <w:r>
-        <w:rPr>
-          <w:i w:val="0"/>
-        </w:rPr>
         <w:t>1. Trabajo Práctico Inicial — “¿Me quedo o me voy? — Laboratorio de experimentación, movimiento y física”.</w:t>
       </w:r>
     </w:p>
     <w:p>
-      <w:pPr/>
       <w:r>
-        <w:rPr>
-          <w:i w:val="0"/>
-        </w:rPr>
-        <w:t>2. Sprint 1 — “Investigación y comparación de alternativas tecnológicas”, elaborado por el equipo.</w:t>
+        <w:t xml:space="preserve">2. Sprint 1 — “Investigación y comparación de alternativas tecnológicas”, </w:t>
+      </w:r>
+      <w:r>
+        <w:t>elaborado por el equipo.</w:t>
       </w:r>
     </w:p>
     <w:sectPr>
-      <w:headerReference w:type="default" r:id="rId27"/>
-      <w:footerReference w:type="default" r:id="rId28"/>
+      <w:headerReference w:type="default" r:id="rId8"/>
+      <w:footerReference w:type="default" r:id="rId9"/>
       <w:pgSz w:w="12240" w:h="15840"/>
       <w:pgMar w:top="1304" w:right="1417" w:bottom="1247" w:left="1417" w:header="720" w:footer="720" w:gutter="0"/>
       <w:cols w:space="720"/>
@@ -14467,6 +15039,54 @@
       <w:sz w:val="19"/>
     </w:rPr>
   </w:style>
+  <w:style w:type="paragraph" w:customStyle="1" w:styleId="artifact-docx-previewttulo2">
+    <w:name w:val="artifact-docx-preview_ttulo2"/>
+    <w:basedOn w:val="Normal"/>
+    <w:rsid w:val="000F313C"/>
+    <w:pPr>
+      <w:spacing w:before="100" w:beforeAutospacing="1" w:after="100" w:afterAutospacing="1" w:line="240" w:lineRule="auto"/>
+    </w:pPr>
+    <w:rPr>
+      <w:rFonts w:ascii="Times New Roman" w:eastAsia="Times New Roman" w:hAnsi="Times New Roman" w:cs="Times New Roman"/>
+      <w:color w:val="auto"/>
+      <w:sz w:val="24"/>
+      <w:szCs w:val="24"/>
+      <w:lang w:val="es-ES" w:eastAsia="es-ES"/>
+    </w:rPr>
+  </w:style>
+  <w:style w:type="paragraph" w:styleId="NormalWeb">
+    <w:name w:val="Normal (Web)"/>
+    <w:basedOn w:val="Normal"/>
+    <w:uiPriority w:val="99"/>
+    <w:semiHidden/>
+    <w:unhideWhenUsed/>
+    <w:rsid w:val="000F313C"/>
+    <w:pPr>
+      <w:spacing w:before="100" w:beforeAutospacing="1" w:after="100" w:afterAutospacing="1" w:line="240" w:lineRule="auto"/>
+    </w:pPr>
+    <w:rPr>
+      <w:rFonts w:ascii="Times New Roman" w:eastAsia="Times New Roman" w:hAnsi="Times New Roman" w:cs="Times New Roman"/>
+      <w:color w:val="auto"/>
+      <w:sz w:val="24"/>
+      <w:szCs w:val="24"/>
+      <w:lang w:val="es-ES" w:eastAsia="es-ES"/>
+    </w:rPr>
+  </w:style>
+  <w:style w:type="paragraph" w:customStyle="1" w:styleId="artifact-docx-previewttulo1">
+    <w:name w:val="artifact-docx-preview_ttulo1"/>
+    <w:basedOn w:val="Normal"/>
+    <w:rsid w:val="000F313C"/>
+    <w:pPr>
+      <w:spacing w:before="100" w:beforeAutospacing="1" w:after="100" w:afterAutospacing="1" w:line="240" w:lineRule="auto"/>
+    </w:pPr>
+    <w:rPr>
+      <w:rFonts w:ascii="Times New Roman" w:eastAsia="Times New Roman" w:hAnsi="Times New Roman" w:cs="Times New Roman"/>
+      <w:color w:val="auto"/>
+      <w:sz w:val="24"/>
+      <w:szCs w:val="24"/>
+      <w:lang w:val="es-ES" w:eastAsia="es-ES"/>
+    </w:rPr>
+  </w:style>
 </w:styles>
 </file>
 

</xml_diff>